<commit_message>
edit report and data
</commit_message>
<xml_diff>
--- a/docs/Template_IE221_New.docx
+++ b/docs/Template_IE221_New.docx
@@ -445,6 +445,8 @@
                 <w:lang w:val="vi-VN"/>
               </w:rPr>
             </w:pPr>
+            <w:bookmarkStart w:id="0" w:name="_GoBack"/>
+            <w:bookmarkEnd w:id="0"/>
           </w:p>
         </w:tc>
         <w:tc>
@@ -640,12 +642,12 @@
       <w:r>
         <w:br w:type="page"/>
       </w:r>
-      <w:bookmarkStart w:id="0" w:name="_Toc422604777"/>
+      <w:bookmarkStart w:id="1" w:name="_Toc422604777"/>
       <w:r>
         <w:lastRenderedPageBreak/>
         <w:tab/>
       </w:r>
-      <w:bookmarkEnd w:id="0"/>
+      <w:bookmarkEnd w:id="1"/>
       <w:r>
         <w:t xml:space="preserve">GIỚI THIỆU </w:t>
       </w:r>
@@ -704,6 +706,7 @@
     <w:p>
       <w:pPr>
         <w:pStyle w:val="BT"/>
+        <w:jc w:val="center"/>
         <w:rPr>
           <w:lang w:val="vi-VN"/>
         </w:rPr>
@@ -713,8 +716,8 @@
           <w:noProof/>
         </w:rPr>
         <w:drawing>
-          <wp:inline distT="0" distB="0" distL="0" distR="0" wp14:anchorId="53269770" wp14:editId="33B0893F">
-            <wp:extent cx="5760720" cy="4996815"/>
+          <wp:inline distT="0" distB="0" distL="0" distR="0" wp14:anchorId="53269770" wp14:editId="5D0ABDDC">
+            <wp:extent cx="5319423" cy="4614036"/>
             <wp:effectExtent l="0" t="0" r="0" b="0"/>
             <wp:docPr id="5" name="Picture 5"/>
             <wp:cNvGraphicFramePr>
@@ -736,7 +739,7 @@
                   <pic:spPr>
                     <a:xfrm>
                       <a:off x="0" y="0"/>
-                      <a:ext cx="5760720" cy="4996815"/>
+                      <a:ext cx="5324642" cy="4618563"/>
                     </a:xfrm>
                     <a:prstGeom prst="rect">
                       <a:avLst/>
@@ -794,165 +797,26 @@
     </w:p>
     <w:p>
       <w:pPr>
+        <w:pStyle w:val="Heading2"/>
+        <w:rPr>
+          <w:sz w:val="26"/>
+        </w:rPr>
+      </w:pPr>
+      <w:r>
+        <w:rPr>
+          <w:sz w:val="26"/>
+        </w:rPr>
+        <w:t>Đối tượng chính</w:t>
+      </w:r>
+    </w:p>
+    <w:p>
+      <w:pPr>
         <w:pStyle w:val="BT"/>
-      </w:pPr>
-      <w:r>
-        <w:t>Xây dựng cơ sở dữ liệu dựa trên các đối tượng hiện tại của ngân hàng. Cấu trúc gồm các đối tượng chính và các đối tượng ghi</w:t>
-      </w:r>
-      <w:r>
-        <w:t xml:space="preserve"> thông tin</w:t>
-      </w:r>
-      <w:r>
-        <w:t xml:space="preserve"> log </w:t>
-      </w:r>
-      <w:r>
-        <w:t>cho các đối tượng chính.</w:t>
-      </w:r>
-    </w:p>
-    <w:p>
-      <w:pPr>
-        <w:pStyle w:val="BT"/>
-        <w:rPr>
-          <w:b/>
-          <w:lang w:val="vi-VN"/>
-        </w:rPr>
-      </w:pPr>
-      <w:r>
-        <w:rPr>
-          <w:lang w:val="vi-VN"/>
-        </w:rPr>
-        <w:t xml:space="preserve">Viết tốt được </w:t>
-      </w:r>
-      <w:r>
-        <w:rPr>
-          <w:b/>
-          <w:highlight w:val="yellow"/>
-        </w:rPr>
-        <w:t>6</w:t>
-      </w:r>
-      <w:r>
-        <w:rPr>
-          <w:b/>
-          <w:highlight w:val="yellow"/>
-          <w:lang w:val="vi-VN"/>
-        </w:rPr>
-        <w:t xml:space="preserve"> điểm</w:t>
-      </w:r>
-    </w:p>
-    <w:p>
-      <w:pPr>
-        <w:pStyle w:val="BT"/>
-        <w:numPr>
-          <w:ilvl w:val="0"/>
-          <w:numId w:val="12"/>
-        </w:numPr>
-        <w:rPr>
-          <w:bCs/>
-        </w:rPr>
-      </w:pPr>
-      <w:r>
-        <w:rPr>
-          <w:bCs/>
-        </w:rPr>
-        <w:lastRenderedPageBreak/>
-        <w:t>Vẽ sơ đồ chức năng hệ thống.</w:t>
-      </w:r>
-      <w:r>
-        <w:rPr>
-          <w:bCs/>
-        </w:rPr>
-        <w:t xml:space="preserve"> Gồm bao nhiêu chức năng. Sau đó, viết đoạn mô tả từng chức năng. Cuối cùng, nhận xét đánh giá chức năng nào là hài lòng nhất trong tất cả các chức năng.</w:t>
-      </w:r>
-    </w:p>
-    <w:p>
-      <w:pPr>
-        <w:pStyle w:val="BT"/>
-        <w:numPr>
-          <w:ilvl w:val="0"/>
-          <w:numId w:val="12"/>
-        </w:numPr>
-        <w:rPr>
-          <w:bCs/>
-        </w:rPr>
-      </w:pPr>
-      <w:r>
-        <w:rPr>
-          <w:bCs/>
-        </w:rPr>
-        <w:t>Trình bày s</w:t>
-      </w:r>
-      <w:r>
-        <w:rPr>
-          <w:bCs/>
-        </w:rPr>
-        <w:t>ơ đồ lớp (nếu có)</w:t>
-      </w:r>
-    </w:p>
-    <w:p>
-      <w:pPr>
-        <w:pStyle w:val="BT"/>
-        <w:numPr>
-          <w:ilvl w:val="0"/>
-          <w:numId w:val="12"/>
-        </w:numPr>
-      </w:pPr>
-      <w:r>
-        <w:rPr>
-          <w:bCs/>
-        </w:rPr>
-        <w:t xml:space="preserve">Giới thiệu </w:t>
-      </w:r>
-      <w:r>
-        <w:rPr>
-          <w:bCs/>
-        </w:rPr>
-        <w:t>Cơ sở dữ liệu</w:t>
-      </w:r>
-      <w:r>
-        <w:rPr>
-          <w:bCs/>
-        </w:rPr>
-        <w:t xml:space="preserve"> </w:t>
-      </w:r>
-      <w:r>
-        <w:rPr>
-          <w:bCs/>
-        </w:rPr>
-        <w:t>(nếu có)</w:t>
-      </w:r>
-      <w:r>
-        <w:t xml:space="preserve"> </w:t>
-      </w:r>
-    </w:p>
-    <w:p>
-      <w:pPr>
-        <w:pStyle w:val="BT"/>
-      </w:pPr>
-      <w:r>
-        <w:t>Nhớ mô tả và giải thích chi tiết các hình.</w:t>
-      </w:r>
-    </w:p>
-    <w:p>
-      <w:pPr>
-        <w:pStyle w:val="BT"/>
-        <w:rPr>
-          <w:bCs/>
-        </w:rPr>
-      </w:pPr>
-    </w:p>
-    <w:p>
-      <w:pPr>
-        <w:pStyle w:val="Heading2"/>
-        <w:rPr>
-          <w:sz w:val="26"/>
-        </w:rPr>
-      </w:pPr>
-      <w:r>
-        <w:rPr>
-          <w:sz w:val="26"/>
-        </w:rPr>
-        <w:t>Đối tượng chính</w:t>
-      </w:r>
+        <w:spacing w:before="0"/>
+        <w:rPr>
+          <w:szCs w:val="26"/>
+        </w:rPr>
+      </w:pPr>
     </w:p>
     <w:p>
       <w:pPr>
@@ -967,11 +831,12 @@
         <w:rPr>
           <w:noProof/>
         </w:rPr>
+        <w:lastRenderedPageBreak/>
         <w:drawing>
-          <wp:inline distT="0" distB="0" distL="0" distR="0" wp14:anchorId="1FC23EF8" wp14:editId="79F66451">
-            <wp:extent cx="1743075" cy="1504950"/>
-            <wp:effectExtent l="0" t="0" r="9525" b="0"/>
-            <wp:docPr id="7" name="Picture 7"/>
+          <wp:inline distT="0" distB="0" distL="0" distR="0" wp14:anchorId="622ABD9A" wp14:editId="505B0321">
+            <wp:extent cx="2894275" cy="1356960"/>
+            <wp:effectExtent l="0" t="0" r="1905" b="0"/>
+            <wp:docPr id="42" name="Picture 42"/>
             <wp:cNvGraphicFramePr>
               <a:graphicFrameLocks xmlns:a="http://schemas.openxmlformats.org/drawingml/2006/main" noChangeAspect="1"/>
             </wp:cNvGraphicFramePr>
@@ -991,7 +856,7 @@
                   <pic:spPr>
                     <a:xfrm>
                       <a:off x="0" y="0"/>
-                      <a:ext cx="1743075" cy="1504950"/>
+                      <a:ext cx="2914641" cy="1366508"/>
                     </a:xfrm>
                     <a:prstGeom prst="rect">
                       <a:avLst/>
@@ -1044,22 +909,36 @@
           <w:i/>
           <w:iCs/>
         </w:rPr>
-        <w:t xml:space="preserve"> Bảng tài khoản</w:t>
-      </w:r>
-    </w:p>
-    <w:p>
-      <w:pPr>
-        <w:pStyle w:val="BT"/>
-        <w:spacing w:before="0"/>
-        <w:rPr>
-          <w:szCs w:val="26"/>
-        </w:rPr>
-      </w:pPr>
-      <w:r>
-        <w:rPr>
-          <w:szCs w:val="26"/>
-        </w:rPr>
-        <w:t>Khách hàng sẽ có các tài khoản</w:t>
+        <w:t xml:space="preserve"> Bảng khách hàng</w:t>
+      </w:r>
+      <w:r>
+        <w:rPr>
+          <w:bCs/>
+          <w:i/>
+          <w:iCs/>
+        </w:rPr>
+        <w:t xml:space="preserve"> và Số ĐT khách hàng</w:t>
+      </w:r>
+    </w:p>
+    <w:p>
+      <w:pPr>
+        <w:pStyle w:val="-G1"/>
+        <w:rPr>
+          <w:bCs/>
+          <w:i/>
+          <w:iCs/>
+        </w:rPr>
+      </w:pPr>
+      <w:r>
+        <w:t>Đầu tiền ta có bảng khách hàng, mỗi 1 khách hàng sẽ được lưu trữ tên, địa chỉ và đánh mã để nhận diện.</w:t>
+      </w:r>
+    </w:p>
+    <w:p>
+      <w:pPr>
+        <w:pStyle w:val="-G1"/>
+      </w:pPr>
+      <w:r>
+        <w:t>Thông tin số điện thoại khách hàng sẽ được lưu trữ trên bảng khachhang_sdt, mỗi khách hàng sẽ có nhiều số điện thoại để tiện liên hệ khi cần.</w:t>
       </w:r>
     </w:p>
     <w:p>
@@ -1076,10 +955,10 @@
           <w:noProof/>
         </w:rPr>
         <w:drawing>
-          <wp:inline distT="0" distB="0" distL="0" distR="0" wp14:anchorId="743CE1E6" wp14:editId="5EB32D30">
-            <wp:extent cx="2266950" cy="1847850"/>
-            <wp:effectExtent l="0" t="0" r="0" b="0"/>
-            <wp:docPr id="8" name="Picture 8"/>
+          <wp:inline distT="0" distB="0" distL="0" distR="0" wp14:anchorId="2DFB704A" wp14:editId="105607CD">
+            <wp:extent cx="3713259" cy="1371420"/>
+            <wp:effectExtent l="0" t="0" r="1905" b="635"/>
+            <wp:docPr id="34" name="Picture 34"/>
             <wp:cNvGraphicFramePr>
               <a:graphicFrameLocks xmlns:a="http://schemas.openxmlformats.org/drawingml/2006/main" noChangeAspect="1"/>
             </wp:cNvGraphicFramePr>
@@ -1099,7 +978,7 @@
                   <pic:spPr>
                     <a:xfrm>
                       <a:off x="0" y="0"/>
-                      <a:ext cx="2266950" cy="1847850"/>
+                      <a:ext cx="3746560" cy="1383719"/>
                     </a:xfrm>
                     <a:prstGeom prst="rect">
                       <a:avLst/>
@@ -1136,7 +1015,7 @@
           <w:i/>
           <w:iCs/>
         </w:rPr>
-        <w:t>3</w:t>
+        <w:t>4</w:t>
       </w:r>
       <w:r>
         <w:rPr>
@@ -1152,7 +1031,7 @@
           <w:i/>
           <w:iCs/>
         </w:rPr>
-        <w:t xml:space="preserve"> Bả</w:t>
+        <w:t xml:space="preserve"> Bảng khách hàng cá nhân</w:t>
       </w:r>
       <w:r>
         <w:rPr>
@@ -1160,7 +1039,23 @@
           <w:i/>
           <w:iCs/>
         </w:rPr>
-        <w:t>ng tài khoản vay tiền</w:t>
+        <w:t xml:space="preserve"> và khách hàng tổ chức doanh nghiệp</w:t>
+      </w:r>
+    </w:p>
+    <w:p>
+      <w:pPr>
+        <w:pStyle w:val="-G1"/>
+      </w:pPr>
+      <w:r>
+        <w:t>Khách hàng sẽ được chia làm 2 nhóm là khách hàng cá nhân và khách hàng doanh nghiệp, để dễ quản lý chúng ta sẽ chia làm 2 bảng khachhangcanhan và khachhangtochucdoanhnghiep.</w:t>
+      </w:r>
+    </w:p>
+    <w:p>
+      <w:pPr>
+        <w:pStyle w:val="-G1"/>
+      </w:pPr>
+      <w:r>
+        <w:t>Mỗi bảng sẽ thực hiện lưu trữ bổ sung các thông tin cho bảng khachhang,  bảng khachhangcanhan sẽ lưu trữ thêm nghề nghiệp, thu nhập; bảng khachhangtochucdoanhnghiep sẽ lưu trữ người đại diện, quy mô tổ chức.</w:t>
       </w:r>
     </w:p>
     <w:p>
@@ -1172,25 +1067,15 @@
           <w:szCs w:val="26"/>
         </w:rPr>
       </w:pPr>
-    </w:p>
-    <w:p>
-      <w:pPr>
-        <w:pStyle w:val="BT"/>
-        <w:spacing w:before="0"/>
-        <w:jc w:val="center"/>
-        <w:rPr>
-          <w:szCs w:val="26"/>
-        </w:rPr>
-      </w:pPr>
       <w:r>
         <w:rPr>
           <w:noProof/>
         </w:rPr>
         <w:drawing>
-          <wp:inline distT="0" distB="0" distL="0" distR="0" wp14:anchorId="5E195A85" wp14:editId="0DB297AE">
-            <wp:extent cx="1847850" cy="1790700"/>
+          <wp:inline distT="0" distB="0" distL="0" distR="0" wp14:anchorId="392ECF10" wp14:editId="41FD7629">
+            <wp:extent cx="5033176" cy="1280486"/>
             <wp:effectExtent l="0" t="0" r="0" b="0"/>
-            <wp:docPr id="9" name="Picture 9"/>
+            <wp:docPr id="37" name="Picture 37"/>
             <wp:cNvGraphicFramePr>
               <a:graphicFrameLocks xmlns:a="http://schemas.openxmlformats.org/drawingml/2006/main" noChangeAspect="1"/>
             </wp:cNvGraphicFramePr>
@@ -1210,7 +1095,7 @@
                   <pic:spPr>
                     <a:xfrm>
                       <a:off x="0" y="0"/>
-                      <a:ext cx="1847850" cy="1790700"/>
+                      <a:ext cx="5101764" cy="1297935"/>
                     </a:xfrm>
                     <a:prstGeom prst="rect">
                       <a:avLst/>
@@ -1247,7 +1132,7 @@
           <w:i/>
           <w:iCs/>
         </w:rPr>
-        <w:t>4</w:t>
+        <w:t>6</w:t>
       </w:r>
       <w:r>
         <w:rPr>
@@ -1263,7 +1148,7 @@
           <w:i/>
           <w:iCs/>
         </w:rPr>
-        <w:t xml:space="preserve"> Bảng tài kho</w:t>
+        <w:t xml:space="preserve"> Các b</w:t>
       </w:r>
       <w:r>
         <w:rPr>
@@ -1271,17 +1156,59 @@
           <w:i/>
           <w:iCs/>
         </w:rPr>
-        <w:t>ản tín dụng</w:t>
-      </w:r>
-    </w:p>
-    <w:p>
-      <w:pPr>
-        <w:pStyle w:val="BT"/>
-        <w:spacing w:before="0"/>
-        <w:rPr>
-          <w:szCs w:val="26"/>
-        </w:rPr>
-      </w:pPr>
+        <w:t>ảng tài khoản</w:t>
+      </w:r>
+    </w:p>
+    <w:p>
+      <w:pPr>
+        <w:pStyle w:val="-G1"/>
+        <w:rPr>
+          <w:bCs/>
+          <w:i/>
+          <w:iCs/>
+        </w:rPr>
+      </w:pPr>
+      <w:r>
+        <w:t>Tài khoản giao dịch sẽ được lưu trữ trên bảng taikhoan, và sẽ được đánh hạng bậc để phân biệt giữa các nhóm khách hàng.</w:t>
+      </w:r>
+    </w:p>
+    <w:p>
+      <w:pPr>
+        <w:pStyle w:val="-G1"/>
+        <w:rPr>
+          <w:bCs/>
+          <w:i/>
+          <w:iCs/>
+        </w:rPr>
+      </w:pPr>
+      <w:r>
+        <w:t>Bảng tài khoản vay tiền</w:t>
+      </w:r>
+      <w:r>
+        <w:t xml:space="preserve"> thực hiện lưu trữ lãi suất, số nợ vay</w:t>
+      </w:r>
+    </w:p>
+    <w:p>
+      <w:pPr>
+        <w:pStyle w:val="-G1"/>
+        <w:rPr>
+          <w:bCs/>
+          <w:i/>
+          <w:iCs/>
+        </w:rPr>
+      </w:pPr>
+      <w:r>
+        <w:lastRenderedPageBreak/>
+        <w:t>Bảng tài khoản tín dụng lưu trữ thông tin hạn mức tín dụng, số dư nợ.</w:t>
+      </w:r>
+    </w:p>
+    <w:p>
+      <w:pPr>
+        <w:pStyle w:val="-G1"/>
+      </w:pPr>
+      <w:r>
+        <w:t>Bảng tài khoản gửi tiền được sử dụng để lưu trữ thông tin lãi suất tiền gửi, số dư tiền gửi.</w:t>
+      </w:r>
     </w:p>
     <w:p>
       <w:pPr>
@@ -1296,12 +1223,11 @@
         <w:rPr>
           <w:noProof/>
         </w:rPr>
-        <w:lastRenderedPageBreak/>
         <w:drawing>
-          <wp:inline distT="0" distB="0" distL="0" distR="0" wp14:anchorId="1B7ACAD5" wp14:editId="50C40A38">
-            <wp:extent cx="1933575" cy="1685925"/>
-            <wp:effectExtent l="0" t="0" r="9525" b="9525"/>
-            <wp:docPr id="10" name="Picture 10"/>
+          <wp:inline distT="0" distB="0" distL="0" distR="0" wp14:anchorId="0CB8029D" wp14:editId="05E87CC6">
+            <wp:extent cx="3307742" cy="2251102"/>
+            <wp:effectExtent l="0" t="0" r="6985" b="0"/>
+            <wp:docPr id="38" name="Picture 38"/>
             <wp:cNvGraphicFramePr>
               <a:graphicFrameLocks xmlns:a="http://schemas.openxmlformats.org/drawingml/2006/main" noChangeAspect="1"/>
             </wp:cNvGraphicFramePr>
@@ -1321,7 +1247,7 @@
                   <pic:spPr>
                     <a:xfrm>
                       <a:off x="0" y="0"/>
-                      <a:ext cx="1933575" cy="1685925"/>
+                      <a:ext cx="3328544" cy="2265259"/>
                     </a:xfrm>
                     <a:prstGeom prst="rect">
                       <a:avLst/>
@@ -1358,7 +1284,7 @@
           <w:i/>
           <w:iCs/>
         </w:rPr>
-        <w:t>5</w:t>
+        <w:t>10</w:t>
       </w:r>
       <w:r>
         <w:rPr>
@@ -1374,7 +1300,7 @@
           <w:i/>
           <w:iCs/>
         </w:rPr>
-        <w:t xml:space="preserve"> Bả</w:t>
+        <w:t xml:space="preserve"> Bảng giao dịch tổ chức doanh nghiệp</w:t>
       </w:r>
       <w:r>
         <w:rPr>
@@ -1382,7 +1308,31 @@
           <w:i/>
           <w:iCs/>
         </w:rPr>
-        <w:t>ng khách hàng</w:t>
+        <w:t xml:space="preserve"> và giao dịch cá nhân</w:t>
+      </w:r>
+    </w:p>
+    <w:p>
+      <w:pPr>
+        <w:pStyle w:val="-G1"/>
+        <w:rPr>
+          <w:bCs/>
+          <w:i/>
+          <w:iCs/>
+        </w:rPr>
+      </w:pPr>
+      <w:r>
+        <w:t xml:space="preserve">Các giao dịch tổ chức doanh nghiệp sẽ được tổ chức và lưu trữ trên bảng giaodichtochucdoanhnghiep, với các thông tin: số tiền, loại giao dịch, phương thức giao dịch, thời gian thực hiện, …; mỗi 1 khách hàng tổ chức doanh nghiệp sẽ có nhiều lần giao dịch khách nhau; </w:t>
+      </w:r>
+      <w:r>
+        <w:t>MaKHTCDN là mã khách hàng thực hiện giao dịch; đối với khách hàng tổ chức doanh nghiệp các giao dịch chính sẽ liên quan là giao dịch gửi tiền và giao dịch vay tiền.</w:t>
+      </w:r>
+    </w:p>
+    <w:p>
+      <w:pPr>
+        <w:pStyle w:val="-G1"/>
+      </w:pPr>
+      <w:r>
+        <w:t>Bảng giao dịch cá nhân sẽ lưu trữ thông tin các lần giao dịch của khách hàng cá nhân, bao gồm các thông tin: số tiền, loại giao dịch, phương thức giao dịch, thời gian thực hiện, …; MaKHCN là mã khách hàng thực hiện giao dịch; đối với khách hàng cá nhân, các giao dịch sẽ bao gồm là tín dụng và gửi tiền.</w:t>
       </w:r>
     </w:p>
     <w:p>
@@ -1394,25 +1344,15 @@
           <w:szCs w:val="26"/>
         </w:rPr>
       </w:pPr>
-    </w:p>
-    <w:p>
-      <w:pPr>
-        <w:pStyle w:val="BT"/>
-        <w:spacing w:before="0"/>
-        <w:jc w:val="center"/>
-        <w:rPr>
-          <w:szCs w:val="26"/>
-        </w:rPr>
-      </w:pPr>
       <w:r>
         <w:rPr>
           <w:noProof/>
         </w:rPr>
         <w:drawing>
-          <wp:inline distT="0" distB="0" distL="0" distR="0" wp14:anchorId="39EF21DA" wp14:editId="25F28230">
-            <wp:extent cx="1752600" cy="1457325"/>
-            <wp:effectExtent l="0" t="0" r="0" b="9525"/>
-            <wp:docPr id="15" name="Picture 15"/>
+          <wp:inline distT="0" distB="0" distL="0" distR="0" wp14:anchorId="0D16FFF7" wp14:editId="7672AC35">
+            <wp:extent cx="3212327" cy="1849522"/>
+            <wp:effectExtent l="0" t="0" r="7620" b="0"/>
+            <wp:docPr id="39" name="Picture 39"/>
             <wp:cNvGraphicFramePr>
               <a:graphicFrameLocks xmlns:a="http://schemas.openxmlformats.org/drawingml/2006/main" noChangeAspect="1"/>
             </wp:cNvGraphicFramePr>
@@ -1432,7 +1372,7 @@
                   <pic:spPr>
                     <a:xfrm>
                       <a:off x="0" y="0"/>
-                      <a:ext cx="1752600" cy="1457325"/>
+                      <a:ext cx="3231075" cy="1860316"/>
                     </a:xfrm>
                     <a:prstGeom prst="rect">
                       <a:avLst/>
@@ -1469,7 +1409,7 @@
           <w:i/>
           <w:iCs/>
         </w:rPr>
-        <w:t>6</w:t>
+        <w:t>12</w:t>
       </w:r>
       <w:r>
         <w:rPr>
@@ -1485,7 +1425,7 @@
           <w:i/>
           <w:iCs/>
         </w:rPr>
-        <w:t xml:space="preserve"> Bả</w:t>
+        <w:t xml:space="preserve"> Bảng sở hữu tổ chức doanh nghiệp</w:t>
       </w:r>
       <w:r>
         <w:rPr>
@@ -1493,7 +1433,32 @@
           <w:i/>
           <w:iCs/>
         </w:rPr>
-        <w:t>ng số điện thoại khách hàng</w:t>
+        <w:t xml:space="preserve"> và sở hữu cá nhân</w:t>
+      </w:r>
+    </w:p>
+    <w:p>
+      <w:pPr>
+        <w:pStyle w:val="-G1"/>
+        <w:rPr>
+          <w:bCs/>
+          <w:i/>
+          <w:iCs/>
+        </w:rPr>
+      </w:pPr>
+      <w:r>
+        <w:lastRenderedPageBreak/>
+        <w:t xml:space="preserve">Bảng sở hữu tổ chức doanh nghiệp sẽ thực hiện lưu trữ thông tin </w:t>
+      </w:r>
+      <w:r>
+        <w:t>tài khoản gửi tiền, tài khoản vay tiền, mã khách hàng tổ chức doanh nghiệp. Bảng này nhằm mục đích đánh giá hiện tại doanh nghiệp sở hữu bao nhiêu tài khoản gửi tiền, bao nhiều tài khoản vay tiền.</w:t>
+      </w:r>
+    </w:p>
+    <w:p>
+      <w:pPr>
+        <w:pStyle w:val="-G1"/>
+      </w:pPr>
+      <w:r>
+        <w:t>Để quản lý khách hàng cá nhân có bao nhiêu tài khoản tín dụng, tài khoản gửi tiền, ta sử dụng bảng sohuucanhan, với các thông tin mã tài khoản gửi tiền, mã tài khoản tín dụng, mã khách hàng cá nhân, bảng sohuucanhan sẽ đánh giá được thông tin cần quản lý.</w:t>
       </w:r>
     </w:p>
     <w:p>
@@ -1505,25 +1470,15 @@
           <w:szCs w:val="26"/>
         </w:rPr>
       </w:pPr>
-    </w:p>
-    <w:p>
-      <w:pPr>
-        <w:pStyle w:val="BT"/>
-        <w:spacing w:before="0"/>
-        <w:jc w:val="center"/>
-        <w:rPr>
-          <w:szCs w:val="26"/>
-        </w:rPr>
-      </w:pPr>
       <w:r>
         <w:rPr>
           <w:noProof/>
         </w:rPr>
         <w:drawing>
-          <wp:inline distT="0" distB="0" distL="0" distR="0" wp14:anchorId="502ADF91" wp14:editId="17CF9259">
-            <wp:extent cx="2066925" cy="1962150"/>
-            <wp:effectExtent l="0" t="0" r="9525" b="0"/>
-            <wp:docPr id="11" name="Picture 11"/>
+          <wp:inline distT="0" distB="0" distL="0" distR="0" wp14:anchorId="3ADEC46E" wp14:editId="3AAD93B3">
+            <wp:extent cx="2973788" cy="1520120"/>
+            <wp:effectExtent l="0" t="0" r="0" b="4445"/>
+            <wp:docPr id="40" name="Picture 40"/>
             <wp:cNvGraphicFramePr>
               <a:graphicFrameLocks xmlns:a="http://schemas.openxmlformats.org/drawingml/2006/main" noChangeAspect="1"/>
             </wp:cNvGraphicFramePr>
@@ -1543,7 +1498,7 @@
                   <pic:spPr>
                     <a:xfrm>
                       <a:off x="0" y="0"/>
-                      <a:ext cx="2066925" cy="1962150"/>
+                      <a:ext cx="2992930" cy="1529905"/>
                     </a:xfrm>
                     <a:prstGeom prst="rect">
                       <a:avLst/>
@@ -1580,7 +1535,7 @@
           <w:i/>
           <w:iCs/>
         </w:rPr>
-        <w:t>7</w:t>
+        <w:t>14</w:t>
       </w:r>
       <w:r>
         <w:rPr>
@@ -1596,45 +1551,71 @@
           <w:i/>
           <w:iCs/>
         </w:rPr>
-        <w:t xml:space="preserve"> Bả</w:t>
-      </w:r>
-      <w:r>
+        <w:t xml:space="preserve"> Bảng nhân viên</w:t>
+      </w:r>
+    </w:p>
+    <w:p>
+      <w:pPr>
+        <w:pStyle w:val="-G1"/>
         <w:rPr>
           <w:bCs/>
           <w:i/>
           <w:iCs/>
         </w:rPr>
-        <w:t>ng khách hàng cá nhân</w:t>
+      </w:pPr>
+      <w:r>
+        <w:t>Chúng ta cũng sẽ quản lý nhân viên, lưu thông tin nhân viên trên bảng nhanvien, bao gồm: Tên, địa chỉ, cấp bậc.</w:t>
+      </w:r>
+    </w:p>
+    <w:p>
+      <w:pPr>
+        <w:pStyle w:val="-G1"/>
+      </w:pPr>
+      <w:r>
+        <w:t>Mỗi nhân viên cũng sẽ có nhiều SĐT, để tiện quản lý chúng ta sẽ tách thành bảng nhanvien_sdt, với thông tin manv, sdt.</w:t>
+      </w:r>
+    </w:p>
+    <w:p>
+      <w:pPr>
+        <w:pStyle w:val="Heading2"/>
+        <w:rPr>
+          <w:sz w:val="26"/>
+        </w:rPr>
+      </w:pPr>
+      <w:r>
+        <w:rPr>
+          <w:sz w:val="26"/>
+        </w:rPr>
+        <w:t>Đối tượng phụ</w:t>
       </w:r>
     </w:p>
     <w:p>
       <w:pPr>
         <w:pStyle w:val="BT"/>
-        <w:spacing w:before="0"/>
         <w:jc w:val="center"/>
         <w:rPr>
-          <w:szCs w:val="26"/>
+          <w:lang w:val="vi-VN"/>
         </w:rPr>
       </w:pPr>
     </w:p>
     <w:p>
       <w:pPr>
         <w:pStyle w:val="BT"/>
-        <w:spacing w:before="0"/>
         <w:jc w:val="center"/>
         <w:rPr>
-          <w:szCs w:val="26"/>
+          <w:lang w:val="vi-VN"/>
         </w:rPr>
       </w:pPr>
       <w:r>
         <w:rPr>
           <w:noProof/>
         </w:rPr>
+        <w:lastRenderedPageBreak/>
         <w:drawing>
-          <wp:inline distT="0" distB="0" distL="0" distR="0" wp14:anchorId="435B2895" wp14:editId="1B30C628">
-            <wp:extent cx="2819400" cy="1847850"/>
-            <wp:effectExtent l="0" t="0" r="0" b="0"/>
-            <wp:docPr id="12" name="Picture 12"/>
+          <wp:inline distT="0" distB="0" distL="0" distR="0" wp14:anchorId="52BA3E8D" wp14:editId="5717AB89">
+            <wp:extent cx="5653377" cy="4727350"/>
+            <wp:effectExtent l="0" t="0" r="5080" b="0"/>
+            <wp:docPr id="41" name="Picture 41"/>
             <wp:cNvGraphicFramePr>
               <a:graphicFrameLocks xmlns:a="http://schemas.openxmlformats.org/drawingml/2006/main" noChangeAspect="1"/>
             </wp:cNvGraphicFramePr>
@@ -1654,7 +1635,7 @@
                   <pic:spPr>
                     <a:xfrm>
                       <a:off x="0" y="0"/>
-                      <a:ext cx="2819400" cy="1847850"/>
+                      <a:ext cx="5666135" cy="4738019"/>
                     </a:xfrm>
                     <a:prstGeom prst="rect">
                       <a:avLst/>
@@ -1683,7 +1664,6 @@
           <w:i/>
           <w:iCs/>
         </w:rPr>
-        <w:lastRenderedPageBreak/>
         <w:t xml:space="preserve">Hình </w:t>
       </w:r>
       <w:r>
@@ -1692,7 +1672,7 @@
           <w:i/>
           <w:iCs/>
         </w:rPr>
-        <w:t>8</w:t>
+        <w:t>16</w:t>
       </w:r>
       <w:r>
         <w:rPr>
@@ -1708,7 +1688,7 @@
           <w:i/>
           <w:iCs/>
         </w:rPr>
-        <w:t xml:space="preserve"> Bả</w:t>
+        <w:t xml:space="preserve"> </w:t>
       </w:r>
       <w:r>
         <w:rPr>
@@ -1716,36 +1696,225 @@
           <w:i/>
           <w:iCs/>
         </w:rPr>
-        <w:t>ng khách hàng tổ chức doanh nghiệp</w:t>
-      </w:r>
-    </w:p>
-    <w:p>
-      <w:pPr>
-        <w:pStyle w:val="BT"/>
-        <w:spacing w:before="0"/>
-        <w:rPr>
-          <w:szCs w:val="26"/>
-        </w:rPr>
-      </w:pPr>
-    </w:p>
-    <w:p>
-      <w:pPr>
-        <w:pStyle w:val="BT"/>
-        <w:spacing w:before="0"/>
-        <w:jc w:val="center"/>
-        <w:rPr>
-          <w:szCs w:val="26"/>
-        </w:rPr>
+        <w:t>Các bảng log chức năng</w:t>
+      </w:r>
+    </w:p>
+    <w:p>
+      <w:pPr>
+        <w:pStyle w:val="-G1"/>
+        <w:rPr>
+          <w:lang w:val="vi-VN"/>
+        </w:rPr>
+      </w:pPr>
+      <w:r>
+        <w:t>Bảng taikhoantindung_log thực hiện ghi log các thao tác thay đổi thông tin tài khoản tín dụng, lưu trữ history các hạn mức cũ, mới, số nợ cũ, mới.</w:t>
+      </w:r>
+    </w:p>
+    <w:p>
+      <w:pPr>
+        <w:pStyle w:val="-G1"/>
+        <w:rPr>
+          <w:bCs/>
+          <w:i/>
+          <w:iCs/>
+        </w:rPr>
+      </w:pPr>
+      <w:r>
+        <w:t>Bảng ghi log thao tác thay đổi thông tin giao dịch cá nhân, lưu trữ history cho việc truy vết giao dịch.</w:t>
+      </w:r>
+    </w:p>
+    <w:p>
+      <w:pPr>
+        <w:pStyle w:val="-G1"/>
+        <w:rPr>
+          <w:bCs/>
+          <w:i/>
+          <w:iCs/>
+        </w:rPr>
+      </w:pPr>
+      <w:r>
+        <w:t>Bảng lưu thông tin history của khách hàng cá nhân, lưu các lần thay đổi, các thông tin nghề nghiệp, thu nhập mới cũ.</w:t>
+      </w:r>
+    </w:p>
+    <w:p>
+      <w:pPr>
+        <w:pStyle w:val="-G1"/>
+        <w:rPr>
+          <w:bCs/>
+          <w:i/>
+          <w:iCs/>
+        </w:rPr>
+      </w:pPr>
+      <w:r>
+        <w:t>Bảng taikhoan_log lưu trữ thông tin các lần thay đổi thông tin tài khoản, hỗ trợ cho truy vết thay đổi.</w:t>
+      </w:r>
+    </w:p>
+    <w:p>
+      <w:pPr>
+        <w:pStyle w:val="-G1"/>
+        <w:rPr>
+          <w:bCs/>
+          <w:i/>
+          <w:iCs/>
+        </w:rPr>
+      </w:pPr>
+      <w:r>
+        <w:t>Bảng sohuutochucdoanhnghiep_log thực hiện lưu history các thao tác thay đổi thông tin trên bảng sohuutochucdoanhnghiep.</w:t>
+      </w:r>
+    </w:p>
+    <w:p>
+      <w:pPr>
+        <w:pStyle w:val="-G1"/>
+      </w:pPr>
+      <w:r>
+        <w:t>Bảng log khách hàng tổ chức doanh nghiệp lưu trữ thông tin history thao tác trên bảng khachhangtochucdoanhnghiep, hỗ trợ truy vết thao tác.</w:t>
+      </w:r>
+    </w:p>
+    <w:p>
+      <w:pPr>
+        <w:pStyle w:val="-G1"/>
+        <w:rPr>
+          <w:bCs/>
+          <w:i/>
+          <w:iCs/>
+        </w:rPr>
+      </w:pPr>
+      <w:r>
+        <w:lastRenderedPageBreak/>
+        <w:t>Bảng log nhân viên, lưu thông tin thao tác thay đổi thông tin nhân viên, các thông tin tên, địa chỉ, cấp bậc.</w:t>
+      </w:r>
+    </w:p>
+    <w:p>
+      <w:pPr>
+        <w:pStyle w:val="-G1"/>
+        <w:rPr>
+          <w:bCs/>
+          <w:i/>
+          <w:iCs/>
+        </w:rPr>
+      </w:pPr>
+      <w:r>
+        <w:t>Bảng taikhoanguitien_log thực hiện lưu trữ thông tin thao tác cập nhật thông tin trên bảng taikhoanguitien, bao gồm các thông tin: lãi suất, số dư.</w:t>
+      </w:r>
+    </w:p>
+    <w:p>
+      <w:pPr>
+        <w:pStyle w:val="-G1"/>
+        <w:rPr>
+          <w:bCs/>
+          <w:i/>
+          <w:iCs/>
+        </w:rPr>
+      </w:pPr>
+      <w:r>
+        <w:t>Các thao tác cập nhật thông tin trên bảng giaodichtochucdoanhnghiep sẽ được lưu trữ lại trên bảng giaodichtochucdoanhnghiep_log, hỗ trợ truy vết cập nhật dữ liệu, tránh thất thoát giao dịch</w:t>
+      </w:r>
+      <w:r>
+        <w:t>.</w:t>
+      </w:r>
+    </w:p>
+    <w:p>
+      <w:pPr>
+        <w:pStyle w:val="-G1"/>
+        <w:rPr>
+          <w:bCs/>
+          <w:i/>
+          <w:iCs/>
+        </w:rPr>
+      </w:pPr>
+      <w:r>
+        <w:t>Bảng log số điện thoại nhân viên lưu trữ thao tác thực hiện thay đổi số điện thoại nhân viên, bao gồm các thông tin: thời gian thao tác, nhân viên thao tác, số đt mới, cũ.</w:t>
+      </w:r>
+    </w:p>
+    <w:p>
+      <w:pPr>
+        <w:pStyle w:val="-G1"/>
+        <w:rPr>
+          <w:bCs/>
+          <w:i/>
+          <w:iCs/>
+        </w:rPr>
+      </w:pPr>
+      <w:r>
+        <w:t>Bảng log sở hữu cá nhân thực hiện lưu trữ thao tác thay đổi thông tin trên bảng sohuucanhan, bao gồm các thông tin: thời gian thay đổi, nhân viên thay đổi, …</w:t>
+      </w:r>
+    </w:p>
+    <w:p>
+      <w:pPr>
+        <w:pStyle w:val="-G1"/>
+        <w:rPr>
+          <w:bCs/>
+          <w:i/>
+          <w:iCs/>
+        </w:rPr>
+      </w:pPr>
+      <w:r>
+        <w:t>Các thao tác thay đổi thông tin trên bảng số điện thoại khách hàng sẽ được lưu trữ lại trên bảng khachhang_sdt_log để dễ dàng truy vết cập nhật, tránh thất thoát thông tin.</w:t>
+      </w:r>
+    </w:p>
+    <w:p>
+      <w:pPr>
+        <w:pStyle w:val="-G1"/>
+        <w:rPr>
+          <w:bCs/>
+          <w:i/>
+          <w:iCs/>
+        </w:rPr>
+      </w:pPr>
+      <w:r>
+        <w:t>Thông tin tài khoản vay tiền khi cập nhật nhật sẽ được lưu log trên bảng taikhoanvaytien_log, bao gồm các thông tin: thời gian thao tác, tài khoản thay đổi, lãi suất, số nợ.</w:t>
+      </w:r>
+    </w:p>
+    <w:p>
+      <w:pPr>
+        <w:pStyle w:val="-G1"/>
+        <w:rPr>
+          <w:lang w:val="vi-VN"/>
+        </w:rPr>
+      </w:pPr>
+      <w:r>
+        <w:t>Khách hàng khi có thay đổi thông tin sẽ được lưu trữ lại thông tin cũ, để tránh thất thoát dữ liệu, bảng khachhang_log sẽ thực hiện lưu trữ các thao tác cập nhật này.</w:t>
+      </w:r>
+    </w:p>
+    <w:p>
+      <w:pPr>
+        <w:pStyle w:val="Heading1"/>
+        <w:rPr>
+          <w:lang w:val="en-US"/>
+        </w:rPr>
+      </w:pPr>
+      <w:r>
+        <w:rPr>
+          <w:lang w:val="en-US"/>
+        </w:rPr>
+        <w:t xml:space="preserve"> </w:t>
+      </w:r>
+      <w:r>
+        <w:rPr>
+          <w:lang w:val="en-US"/>
+        </w:rPr>
+        <w:tab/>
+      </w:r>
+      <w:r>
+        <w:rPr>
+          <w:lang w:val="en-US"/>
+        </w:rPr>
+        <w:t>CHỨC NĂNG HỆ THỐNG</w:t>
+      </w:r>
+    </w:p>
+    <w:p>
+      <w:pPr>
+        <w:pStyle w:val="Hnh-Bng"/>
       </w:pPr>
       <w:r>
         <w:rPr>
           <w:noProof/>
         </w:rPr>
         <w:drawing>
-          <wp:inline distT="0" distB="0" distL="0" distR="0" wp14:anchorId="0ED95205" wp14:editId="422C35A7">
-            <wp:extent cx="2571750" cy="3143250"/>
-            <wp:effectExtent l="0" t="0" r="0" b="0"/>
-            <wp:docPr id="13" name="Picture 13"/>
+          <wp:inline distT="0" distB="0" distL="0" distR="0" wp14:anchorId="38F43E59" wp14:editId="702D25AB">
+            <wp:extent cx="3421111" cy="1963972"/>
+            <wp:effectExtent l="0" t="0" r="8255" b="0"/>
+            <wp:docPr id="43" name="Picture 43"/>
             <wp:cNvGraphicFramePr>
               <a:graphicFrameLocks xmlns:a="http://schemas.openxmlformats.org/drawingml/2006/main" noChangeAspect="1"/>
             </wp:cNvGraphicFramePr>
@@ -1765,7 +1934,7 @@
                   <pic:spPr>
                     <a:xfrm>
                       <a:off x="0" y="0"/>
-                      <a:ext cx="2571750" cy="3143250"/>
+                      <a:ext cx="3517180" cy="2019123"/>
                     </a:xfrm>
                     <a:prstGeom prst="rect">
                       <a:avLst/>
@@ -1802,7 +1971,7 @@
           <w:i/>
           <w:iCs/>
         </w:rPr>
-        <w:t>9</w:t>
+        <w:t>16</w:t>
       </w:r>
       <w:r>
         <w:rPr>
@@ -1818,7 +1987,7 @@
           <w:i/>
           <w:iCs/>
         </w:rPr>
-        <w:t xml:space="preserve"> Bả</w:t>
+        <w:t xml:space="preserve"> </w:t>
       </w:r>
       <w:r>
         <w:rPr>
@@ -1826,37 +1995,36 @@
           <w:i/>
           <w:iCs/>
         </w:rPr>
-        <w:t>ng giao dịch tổ chức doanh nghiệp</w:t>
-      </w:r>
-    </w:p>
-    <w:p>
-      <w:pPr>
-        <w:pStyle w:val="BT"/>
-        <w:spacing w:before="0"/>
+        <w:t>Giao diện chính</w:t>
+      </w:r>
+    </w:p>
+    <w:p>
+      <w:pPr>
+        <w:pStyle w:val="-G1"/>
+      </w:pPr>
+      <w:r>
+        <w:lastRenderedPageBreak/>
+        <w:t>Chức năng thêm khách hàng:</w:t>
+      </w:r>
+    </w:p>
+    <w:p>
+      <w:pPr>
+        <w:pStyle w:val="-G1"/>
+        <w:numPr>
+          <w:ilvl w:val="0"/>
+          <w:numId w:val="0"/>
+        </w:numPr>
         <w:jc w:val="center"/>
-        <w:rPr>
-          <w:szCs w:val="26"/>
-        </w:rPr>
-      </w:pPr>
-    </w:p>
-    <w:p>
-      <w:pPr>
-        <w:pStyle w:val="BT"/>
-        <w:spacing w:before="0"/>
-        <w:jc w:val="center"/>
-        <w:rPr>
-          <w:szCs w:val="26"/>
-        </w:rPr>
       </w:pPr>
       <w:r>
         <w:rPr>
           <w:noProof/>
         </w:rPr>
         <w:drawing>
-          <wp:inline distT="0" distB="0" distL="0" distR="0" wp14:anchorId="7501F138" wp14:editId="668FDE96">
-            <wp:extent cx="2047875" cy="3238500"/>
-            <wp:effectExtent l="0" t="0" r="9525" b="0"/>
-            <wp:docPr id="14" name="Picture 14"/>
+          <wp:inline distT="0" distB="0" distL="0" distR="0" wp14:anchorId="1C8FBAC7" wp14:editId="28F16C59">
+            <wp:extent cx="5760720" cy="3279775"/>
+            <wp:effectExtent l="0" t="0" r="0" b="0"/>
+            <wp:docPr id="44" name="Picture 44"/>
             <wp:cNvGraphicFramePr>
               <a:graphicFrameLocks xmlns:a="http://schemas.openxmlformats.org/drawingml/2006/main" noChangeAspect="1"/>
             </wp:cNvGraphicFramePr>
@@ -1876,7 +2044,7 @@
                   <pic:spPr>
                     <a:xfrm>
                       <a:off x="0" y="0"/>
-                      <a:ext cx="2047875" cy="3238500"/>
+                      <a:ext cx="5760720" cy="3279775"/>
                     </a:xfrm>
                     <a:prstGeom prst="rect">
                       <a:avLst/>
@@ -1913,7 +2081,7 @@
           <w:i/>
           <w:iCs/>
         </w:rPr>
-        <w:t>10</w:t>
+        <w:t>16</w:t>
       </w:r>
       <w:r>
         <w:rPr>
@@ -1929,7 +2097,7 @@
           <w:i/>
           <w:iCs/>
         </w:rPr>
-        <w:t xml:space="preserve"> Bả</w:t>
+        <w:t xml:space="preserve"> Giao diện </w:t>
       </w:r>
       <w:r>
         <w:rPr>
@@ -1937,38 +2105,34 @@
           <w:i/>
           <w:iCs/>
         </w:rPr>
-        <w:t>ng giao dịch cá nhân</w:t>
-      </w:r>
-    </w:p>
-    <w:p>
-      <w:pPr>
-        <w:pStyle w:val="BT"/>
-        <w:spacing w:before="0"/>
-        <w:jc w:val="center"/>
-        <w:rPr>
-          <w:szCs w:val="26"/>
-        </w:rPr>
-      </w:pPr>
-    </w:p>
-    <w:p>
-      <w:pPr>
-        <w:pStyle w:val="BT"/>
-        <w:spacing w:before="0"/>
-        <w:jc w:val="center"/>
-        <w:rPr>
-          <w:szCs w:val="26"/>
-        </w:rPr>
+        <w:t>chức năng thêm khách hàng</w:t>
+      </w:r>
+    </w:p>
+    <w:p>
+      <w:pPr>
+        <w:pStyle w:val="-G1"/>
+      </w:pPr>
+      <w:r>
+        <w:t>Chức năng tìm kiếm nhân viên:</w:t>
+      </w:r>
+    </w:p>
+    <w:p>
+      <w:pPr>
+        <w:pStyle w:val="-G1"/>
+        <w:numPr>
+          <w:ilvl w:val="0"/>
+          <w:numId w:val="0"/>
+        </w:numPr>
       </w:pPr>
       <w:r>
         <w:rPr>
           <w:noProof/>
         </w:rPr>
-        <w:lastRenderedPageBreak/>
         <w:drawing>
-          <wp:inline distT="0" distB="0" distL="0" distR="0" wp14:anchorId="076D1E42" wp14:editId="002E6C99">
-            <wp:extent cx="1857375" cy="1771650"/>
-            <wp:effectExtent l="0" t="0" r="9525" b="0"/>
-            <wp:docPr id="16" name="Picture 16"/>
+          <wp:inline distT="0" distB="0" distL="0" distR="0" wp14:anchorId="0CF3355B" wp14:editId="164FE76B">
+            <wp:extent cx="5760720" cy="3168015"/>
+            <wp:effectExtent l="0" t="0" r="0" b="0"/>
+            <wp:docPr id="45" name="Picture 45"/>
             <wp:cNvGraphicFramePr>
               <a:graphicFrameLocks xmlns:a="http://schemas.openxmlformats.org/drawingml/2006/main" noChangeAspect="1"/>
             </wp:cNvGraphicFramePr>
@@ -1988,7 +2152,7 @@
                   <pic:spPr>
                     <a:xfrm>
                       <a:off x="0" y="0"/>
-                      <a:ext cx="1857375" cy="1771650"/>
+                      <a:ext cx="5760720" cy="3168015"/>
                     </a:xfrm>
                     <a:prstGeom prst="rect">
                       <a:avLst/>
@@ -2003,83 +2167,30 @@
     </w:p>
     <w:p>
       <w:pPr>
-        <w:pStyle w:val="BT"/>
-        <w:jc w:val="center"/>
-        <w:rPr>
-          <w:bCs/>
-          <w:i/>
-          <w:iCs/>
-        </w:rPr>
-      </w:pPr>
-      <w:r>
-        <w:rPr>
-          <w:bCs/>
-          <w:i/>
-          <w:iCs/>
-        </w:rPr>
-        <w:t xml:space="preserve">Hình </w:t>
-      </w:r>
-      <w:r>
-        <w:rPr>
-          <w:bCs/>
-          <w:i/>
-          <w:iCs/>
-        </w:rPr>
-        <w:t>11</w:t>
-      </w:r>
-      <w:r>
-        <w:rPr>
-          <w:bCs/>
-          <w:i/>
-          <w:iCs/>
-        </w:rPr>
-        <w:t>.</w:t>
-      </w:r>
-      <w:r>
-        <w:rPr>
-          <w:bCs/>
-          <w:i/>
-          <w:iCs/>
-        </w:rPr>
-        <w:t xml:space="preserve"> Bả</w:t>
-      </w:r>
-      <w:r>
-        <w:rPr>
-          <w:bCs/>
-          <w:i/>
-          <w:iCs/>
-        </w:rPr>
-        <w:t>ng tài khoản gửi tiền</w:t>
-      </w:r>
-    </w:p>
-    <w:p>
-      <w:pPr>
-        <w:pStyle w:val="BT"/>
-        <w:spacing w:before="0"/>
-        <w:jc w:val="center"/>
-        <w:rPr>
-          <w:szCs w:val="26"/>
-        </w:rPr>
-      </w:pPr>
-    </w:p>
-    <w:p>
-      <w:pPr>
-        <w:pStyle w:val="BT"/>
-        <w:spacing w:before="0"/>
-        <w:jc w:val="center"/>
-        <w:rPr>
-          <w:szCs w:val="26"/>
-        </w:rPr>
+        <w:pStyle w:val="-G1"/>
+      </w:pPr>
+      <w:r>
+        <w:t>Chức năng thêm khách hàng:</w:t>
+      </w:r>
+    </w:p>
+    <w:p>
+      <w:pPr>
+        <w:pStyle w:val="-G1"/>
+        <w:numPr>
+          <w:ilvl w:val="0"/>
+          <w:numId w:val="0"/>
+        </w:numPr>
       </w:pPr>
       <w:r>
         <w:rPr>
           <w:noProof/>
         </w:rPr>
+        <w:lastRenderedPageBreak/>
         <w:drawing>
-          <wp:inline distT="0" distB="0" distL="0" distR="0" wp14:anchorId="08AB6D15" wp14:editId="338481B1">
-            <wp:extent cx="2571750" cy="2590800"/>
-            <wp:effectExtent l="0" t="0" r="0" b="0"/>
-            <wp:docPr id="18" name="Picture 18"/>
+          <wp:inline distT="0" distB="0" distL="0" distR="0" wp14:anchorId="62FA17AD" wp14:editId="3D521727">
+            <wp:extent cx="5760720" cy="3158490"/>
+            <wp:effectExtent l="0" t="0" r="0" b="3810"/>
+            <wp:docPr id="46" name="Picture 46"/>
             <wp:cNvGraphicFramePr>
               <a:graphicFrameLocks xmlns:a="http://schemas.openxmlformats.org/drawingml/2006/main" noChangeAspect="1"/>
             </wp:cNvGraphicFramePr>
@@ -2099,7 +2210,7 @@
                   <pic:spPr>
                     <a:xfrm>
                       <a:off x="0" y="0"/>
-                      <a:ext cx="2571750" cy="2590800"/>
+                      <a:ext cx="5760720" cy="3158490"/>
                     </a:xfrm>
                     <a:prstGeom prst="rect">
                       <a:avLst/>
@@ -2114,83 +2225,29 @@
     </w:p>
     <w:p>
       <w:pPr>
-        <w:pStyle w:val="BT"/>
-        <w:jc w:val="center"/>
-        <w:rPr>
-          <w:bCs/>
-          <w:i/>
-          <w:iCs/>
-        </w:rPr>
-      </w:pPr>
-      <w:r>
-        <w:rPr>
-          <w:bCs/>
-          <w:i/>
-          <w:iCs/>
-        </w:rPr>
-        <w:t xml:space="preserve">Hình </w:t>
-      </w:r>
-      <w:r>
-        <w:rPr>
-          <w:bCs/>
-          <w:i/>
-          <w:iCs/>
-        </w:rPr>
-        <w:t>12</w:t>
-      </w:r>
-      <w:r>
-        <w:rPr>
-          <w:bCs/>
-          <w:i/>
-          <w:iCs/>
-        </w:rPr>
-        <w:t>.</w:t>
-      </w:r>
-      <w:r>
-        <w:rPr>
-          <w:bCs/>
-          <w:i/>
-          <w:iCs/>
-        </w:rPr>
-        <w:t xml:space="preserve"> Bả</w:t>
-      </w:r>
-      <w:r>
-        <w:rPr>
-          <w:bCs/>
-          <w:i/>
-          <w:iCs/>
-        </w:rPr>
-        <w:t>ng sở hữu tổ chức doanh nghiệp</w:t>
-      </w:r>
-    </w:p>
-    <w:p>
-      <w:pPr>
-        <w:pStyle w:val="BT"/>
-        <w:spacing w:before="0"/>
-        <w:jc w:val="center"/>
-        <w:rPr>
-          <w:szCs w:val="26"/>
-        </w:rPr>
-      </w:pPr>
-    </w:p>
-    <w:p>
-      <w:pPr>
-        <w:pStyle w:val="BT"/>
-        <w:spacing w:before="0"/>
-        <w:jc w:val="center"/>
-        <w:rPr>
-          <w:szCs w:val="26"/>
-        </w:rPr>
+        <w:pStyle w:val="-G1"/>
+      </w:pPr>
+      <w:r>
+        <w:t>Chức năng tìm kiếm khách hàng:</w:t>
+      </w:r>
+    </w:p>
+    <w:p>
+      <w:pPr>
+        <w:pStyle w:val="-G1"/>
+        <w:numPr>
+          <w:ilvl w:val="0"/>
+          <w:numId w:val="0"/>
+        </w:numPr>
       </w:pPr>
       <w:r>
         <w:rPr>
           <w:noProof/>
         </w:rPr>
         <w:drawing>
-          <wp:inline distT="0" distB="0" distL="0" distR="0" wp14:anchorId="32A80F87" wp14:editId="7468796B">
-            <wp:extent cx="1752600" cy="2466975"/>
-            <wp:effectExtent l="0" t="0" r="0" b="9525"/>
-            <wp:docPr id="19" name="Picture 19"/>
+          <wp:inline distT="0" distB="0" distL="0" distR="0" wp14:anchorId="61ADF236" wp14:editId="2C646C18">
+            <wp:extent cx="5760720" cy="3147060"/>
+            <wp:effectExtent l="0" t="0" r="0" b="0"/>
+            <wp:docPr id="47" name="Picture 47"/>
             <wp:cNvGraphicFramePr>
               <a:graphicFrameLocks xmlns:a="http://schemas.openxmlformats.org/drawingml/2006/main" noChangeAspect="1"/>
             </wp:cNvGraphicFramePr>
@@ -2210,7 +2267,7 @@
                   <pic:spPr>
                     <a:xfrm>
                       <a:off x="0" y="0"/>
-                      <a:ext cx="1752600" cy="2466975"/>
+                      <a:ext cx="5760720" cy="3147060"/>
                     </a:xfrm>
                     <a:prstGeom prst="rect">
                       <a:avLst/>
@@ -2225,73 +2282,19 @@
     </w:p>
     <w:p>
       <w:pPr>
-        <w:pStyle w:val="BT"/>
-        <w:jc w:val="center"/>
-        <w:rPr>
-          <w:bCs/>
-          <w:i/>
-          <w:iCs/>
-        </w:rPr>
-      </w:pPr>
-      <w:r>
-        <w:rPr>
-          <w:bCs/>
-          <w:i/>
-          <w:iCs/>
-        </w:rPr>
-        <w:t xml:space="preserve">Hình </w:t>
-      </w:r>
-      <w:r>
-        <w:rPr>
-          <w:bCs/>
-          <w:i/>
-          <w:iCs/>
-        </w:rPr>
-        <w:t>13</w:t>
-      </w:r>
-      <w:r>
-        <w:rPr>
-          <w:bCs/>
-          <w:i/>
-          <w:iCs/>
-        </w:rPr>
-        <w:t>.</w:t>
-      </w:r>
-      <w:r>
-        <w:rPr>
-          <w:bCs/>
-          <w:i/>
-          <w:iCs/>
-        </w:rPr>
-        <w:t xml:space="preserve"> Bả</w:t>
-      </w:r>
-      <w:r>
-        <w:rPr>
-          <w:bCs/>
-          <w:i/>
-          <w:iCs/>
-        </w:rPr>
-        <w:t>ng sở hữu cá nhân</w:t>
-      </w:r>
-    </w:p>
-    <w:p>
-      <w:pPr>
-        <w:pStyle w:val="BT"/>
-        <w:spacing w:before="0"/>
-        <w:jc w:val="center"/>
-        <w:rPr>
-          <w:szCs w:val="26"/>
-        </w:rPr>
-      </w:pPr>
-    </w:p>
-    <w:p>
-      <w:pPr>
-        <w:pStyle w:val="BT"/>
-        <w:spacing w:before="0"/>
-        <w:jc w:val="center"/>
-        <w:rPr>
-          <w:szCs w:val="26"/>
-        </w:rPr>
+        <w:pStyle w:val="-G1"/>
+      </w:pPr>
+      <w:r>
+        <w:t>Chức năng tạo tài khoản:</w:t>
+      </w:r>
+    </w:p>
+    <w:p>
+      <w:pPr>
+        <w:pStyle w:val="-G1"/>
+        <w:numPr>
+          <w:ilvl w:val="0"/>
+          <w:numId w:val="0"/>
+        </w:numPr>
       </w:pPr>
       <w:r>
         <w:rPr>
@@ -2299,10 +2302,10 @@
         </w:rPr>
         <w:lastRenderedPageBreak/>
         <w:drawing>
-          <wp:inline distT="0" distB="0" distL="0" distR="0" wp14:anchorId="248409E5" wp14:editId="787C6071">
-            <wp:extent cx="1714500" cy="1943100"/>
-            <wp:effectExtent l="0" t="0" r="0" b="0"/>
-            <wp:docPr id="20" name="Picture 20"/>
+          <wp:inline distT="0" distB="0" distL="0" distR="0" wp14:anchorId="567B1586" wp14:editId="7AB43D66">
+            <wp:extent cx="5760720" cy="3141345"/>
+            <wp:effectExtent l="0" t="0" r="0" b="1905"/>
+            <wp:docPr id="48" name="Picture 48"/>
             <wp:cNvGraphicFramePr>
               <a:graphicFrameLocks xmlns:a="http://schemas.openxmlformats.org/drawingml/2006/main" noChangeAspect="1"/>
             </wp:cNvGraphicFramePr>
@@ -2322,7 +2325,7 @@
                   <pic:spPr>
                     <a:xfrm>
                       <a:off x="0" y="0"/>
-                      <a:ext cx="1714500" cy="1943100"/>
+                      <a:ext cx="5760720" cy="3141345"/>
                     </a:xfrm>
                     <a:prstGeom prst="rect">
                       <a:avLst/>
@@ -2337,83 +2340,29 @@
     </w:p>
     <w:p>
       <w:pPr>
-        <w:pStyle w:val="BT"/>
-        <w:jc w:val="center"/>
-        <w:rPr>
-          <w:bCs/>
-          <w:i/>
-          <w:iCs/>
-        </w:rPr>
-      </w:pPr>
-      <w:r>
-        <w:rPr>
-          <w:bCs/>
-          <w:i/>
-          <w:iCs/>
-        </w:rPr>
-        <w:t xml:space="preserve">Hình </w:t>
-      </w:r>
-      <w:r>
-        <w:rPr>
-          <w:bCs/>
-          <w:i/>
-          <w:iCs/>
-        </w:rPr>
-        <w:t>14</w:t>
-      </w:r>
-      <w:r>
-        <w:rPr>
-          <w:bCs/>
-          <w:i/>
-          <w:iCs/>
-        </w:rPr>
-        <w:t>.</w:t>
-      </w:r>
-      <w:r>
-        <w:rPr>
-          <w:bCs/>
-          <w:i/>
-          <w:iCs/>
-        </w:rPr>
-        <w:t xml:space="preserve"> Bả</w:t>
-      </w:r>
-      <w:r>
-        <w:rPr>
-          <w:bCs/>
-          <w:i/>
-          <w:iCs/>
-        </w:rPr>
-        <w:t>ng nhân viên</w:t>
-      </w:r>
-    </w:p>
-    <w:p>
-      <w:pPr>
-        <w:pStyle w:val="BT"/>
-        <w:spacing w:before="0"/>
-        <w:jc w:val="center"/>
-        <w:rPr>
-          <w:szCs w:val="26"/>
-        </w:rPr>
-      </w:pPr>
-    </w:p>
-    <w:p>
-      <w:pPr>
-        <w:pStyle w:val="BT"/>
-        <w:spacing w:before="0"/>
-        <w:jc w:val="center"/>
-        <w:rPr>
-          <w:szCs w:val="26"/>
-        </w:rPr>
+        <w:pStyle w:val="-G1"/>
+      </w:pPr>
+      <w:r>
+        <w:t>Chức năng tạo giao dịch:</w:t>
+      </w:r>
+    </w:p>
+    <w:p>
+      <w:pPr>
+        <w:pStyle w:val="-G1"/>
+        <w:numPr>
+          <w:ilvl w:val="0"/>
+          <w:numId w:val="0"/>
+        </w:numPr>
       </w:pPr>
       <w:r>
         <w:rPr>
           <w:noProof/>
         </w:rPr>
         <w:drawing>
-          <wp:inline distT="0" distB="0" distL="0" distR="0" wp14:anchorId="5D3D41B4" wp14:editId="120E8D9B">
-            <wp:extent cx="1790700" cy="1495425"/>
-            <wp:effectExtent l="0" t="0" r="0" b="9525"/>
-            <wp:docPr id="21" name="Picture 21"/>
+          <wp:inline distT="0" distB="0" distL="0" distR="0" wp14:anchorId="43239EA3" wp14:editId="17C33BEB">
+            <wp:extent cx="5760720" cy="3155950"/>
+            <wp:effectExtent l="0" t="0" r="0" b="6350"/>
+            <wp:docPr id="49" name="Picture 49"/>
             <wp:cNvGraphicFramePr>
               <a:graphicFrameLocks xmlns:a="http://schemas.openxmlformats.org/drawingml/2006/main" noChangeAspect="1"/>
             </wp:cNvGraphicFramePr>
@@ -2433,7 +2382,7 @@
                   <pic:spPr>
                     <a:xfrm>
                       <a:off x="0" y="0"/>
-                      <a:ext cx="1790700" cy="1495425"/>
+                      <a:ext cx="5760720" cy="3155950"/>
                     </a:xfrm>
                     <a:prstGeom prst="rect">
                       <a:avLst/>
@@ -2448,187 +2397,30 @@
     </w:p>
     <w:p>
       <w:pPr>
-        <w:pStyle w:val="BT"/>
-        <w:jc w:val="center"/>
-        <w:rPr>
-          <w:bCs/>
-          <w:i/>
-          <w:iCs/>
-        </w:rPr>
-      </w:pPr>
-      <w:r>
-        <w:rPr>
-          <w:bCs/>
-          <w:i/>
-          <w:iCs/>
-        </w:rPr>
-        <w:t xml:space="preserve">Hình </w:t>
-      </w:r>
-      <w:r>
-        <w:rPr>
-          <w:bCs/>
-          <w:i/>
-          <w:iCs/>
-        </w:rPr>
-        <w:t>15</w:t>
-      </w:r>
-      <w:r>
-        <w:rPr>
-          <w:bCs/>
-          <w:i/>
-          <w:iCs/>
-        </w:rPr>
-        <w:t>.</w:t>
-      </w:r>
-      <w:r>
-        <w:rPr>
-          <w:bCs/>
-          <w:i/>
-          <w:iCs/>
-        </w:rPr>
-        <w:t xml:space="preserve"> Bả</w:t>
-      </w:r>
-      <w:r>
-        <w:rPr>
-          <w:bCs/>
-          <w:i/>
-          <w:iCs/>
-        </w:rPr>
-        <w:t>ng số điện thoại nhân viên</w:t>
-      </w:r>
-    </w:p>
-    <w:p>
-      <w:pPr>
-        <w:pStyle w:val="BT"/>
-        <w:spacing w:before="0"/>
-        <w:jc w:val="center"/>
-        <w:rPr>
-          <w:szCs w:val="26"/>
-        </w:rPr>
-      </w:pPr>
-    </w:p>
-    <w:p>
-      <w:pPr>
-        <w:pStyle w:val="BT"/>
-        <w:spacing w:before="0"/>
-        <w:rPr>
-          <w:szCs w:val="26"/>
-        </w:rPr>
-      </w:pPr>
-      <w:r>
-        <w:rPr>
-          <w:szCs w:val="26"/>
-        </w:rPr>
-        <w:t>Nội dun</w:t>
-      </w:r>
-      <w:r>
-        <w:rPr>
-          <w:szCs w:val="26"/>
-        </w:rPr>
-        <w:t>g đoạn văn dùng Style BT</w:t>
-      </w:r>
-      <w:r>
-        <w:rPr>
-          <w:szCs w:val="26"/>
-        </w:rPr>
-        <w:t xml:space="preserve"> [1]</w:t>
-      </w:r>
-    </w:p>
-    <w:p>
-      <w:pPr>
-        <w:pStyle w:val="BT"/>
-        <w:spacing w:before="0"/>
-        <w:rPr>
-          <w:szCs w:val="26"/>
-          <w:lang w:val="vi-VN"/>
-        </w:rPr>
-      </w:pPr>
-      <w:r>
-        <w:rPr>
-          <w:szCs w:val="26"/>
-        </w:rPr>
-        <w:t xml:space="preserve">Chúng tôi đã xây dựng được chức năng QLSV </w:t>
-      </w:r>
-      <w:r>
-        <w:rPr>
-          <w:color w:val="FF0000"/>
-          <w:szCs w:val="26"/>
-        </w:rPr>
-        <w:t>[Hình 3]</w:t>
-      </w:r>
-      <w:r>
-        <w:rPr>
-          <w:color w:val="FF0000"/>
-          <w:szCs w:val="26"/>
-        </w:rPr>
-        <w:t>.</w:t>
-      </w:r>
-    </w:p>
-    <w:p>
-      <w:pPr>
-        <w:pStyle w:val="BT"/>
+        <w:pStyle w:val="-G1"/>
+      </w:pPr>
+      <w:r>
+        <w:t>Chức năng tìm kiếm giao dịch:</w:t>
+      </w:r>
+    </w:p>
+    <w:p>
+      <w:pPr>
+        <w:pStyle w:val="-G1"/>
         <w:numPr>
           <w:ilvl w:val="0"/>
-          <w:numId w:val="7"/>
+          <w:numId w:val="0"/>
         </w:numPr>
-        <w:rPr>
-          <w:szCs w:val="26"/>
-        </w:rPr>
-      </w:pPr>
-      <w:r>
-        <w:rPr>
-          <w:szCs w:val="26"/>
-          <w:lang w:val="vi-VN"/>
-        </w:rPr>
-        <w:t xml:space="preserve">Gạch đầu dòng này dùng </w:t>
-      </w:r>
-      <w:r>
-        <w:rPr>
-          <w:b/>
-          <w:szCs w:val="26"/>
-          <w:lang w:val="vi-VN"/>
-        </w:rPr>
-        <w:t>Style G1</w:t>
-      </w:r>
-      <w:r>
-        <w:rPr>
-          <w:szCs w:val="26"/>
-          <w:lang w:val="vi-VN"/>
-        </w:rPr>
-        <w:t>.</w:t>
-      </w:r>
-    </w:p>
-    <w:p>
-      <w:pPr>
-        <w:pStyle w:val="Heading2"/>
-        <w:rPr>
-          <w:sz w:val="26"/>
-        </w:rPr>
-      </w:pPr>
-      <w:r>
-        <w:rPr>
-          <w:sz w:val="26"/>
-        </w:rPr>
-        <w:t>Đối tượng phụ</w:t>
-      </w:r>
-    </w:p>
-    <w:p>
-      <w:pPr>
-        <w:pStyle w:val="BT"/>
-        <w:jc w:val="center"/>
-        <w:rPr>
-          <w:lang w:val="vi-VN"/>
-        </w:rPr>
       </w:pPr>
       <w:r>
         <w:rPr>
           <w:noProof/>
         </w:rPr>
+        <w:lastRenderedPageBreak/>
         <w:drawing>
-          <wp:inline distT="0" distB="0" distL="0" distR="0" wp14:anchorId="2005DAC0" wp14:editId="1BA5CB26">
-            <wp:extent cx="2124075" cy="2676525"/>
-            <wp:effectExtent l="0" t="0" r="9525" b="9525"/>
-            <wp:docPr id="22" name="Picture 22"/>
+          <wp:inline distT="0" distB="0" distL="0" distR="0" wp14:anchorId="748C02CF" wp14:editId="0804253E">
+            <wp:extent cx="5760720" cy="3149600"/>
+            <wp:effectExtent l="0" t="0" r="0" b="0"/>
+            <wp:docPr id="50" name="Picture 50"/>
             <wp:cNvGraphicFramePr>
               <a:graphicFrameLocks xmlns:a="http://schemas.openxmlformats.org/drawingml/2006/main" noChangeAspect="1"/>
             </wp:cNvGraphicFramePr>
@@ -2648,7 +2440,7 @@
                   <pic:spPr>
                     <a:xfrm>
                       <a:off x="0" y="0"/>
-                      <a:ext cx="2124075" cy="2676525"/>
+                      <a:ext cx="5760720" cy="3149600"/>
                     </a:xfrm>
                     <a:prstGeom prst="rect">
                       <a:avLst/>
@@ -2663,84 +2455,29 @@
     </w:p>
     <w:p>
       <w:pPr>
-        <w:pStyle w:val="BT"/>
-        <w:jc w:val="center"/>
-        <w:rPr>
-          <w:bCs/>
-          <w:i/>
-          <w:iCs/>
-        </w:rPr>
-      </w:pPr>
-      <w:r>
-        <w:rPr>
-          <w:bCs/>
-          <w:i/>
-          <w:iCs/>
-        </w:rPr>
-        <w:t xml:space="preserve">Hình </w:t>
-      </w:r>
-      <w:r>
-        <w:rPr>
-          <w:bCs/>
-          <w:i/>
-          <w:iCs/>
-        </w:rPr>
-        <w:t>16</w:t>
-      </w:r>
-      <w:r>
-        <w:rPr>
-          <w:bCs/>
-          <w:i/>
-          <w:iCs/>
-        </w:rPr>
-        <w:t>.</w:t>
-      </w:r>
-      <w:r>
-        <w:rPr>
-          <w:bCs/>
-          <w:i/>
-          <w:iCs/>
-        </w:rPr>
-        <w:t xml:space="preserve"> Bảng </w:t>
-      </w:r>
-      <w:r>
-        <w:rPr>
-          <w:bCs/>
-          <w:i/>
-          <w:iCs/>
-        </w:rPr>
-        <w:t>log tài khoản tín dụng</w:t>
-      </w:r>
-    </w:p>
-    <w:p>
-      <w:pPr>
-        <w:pStyle w:val="BT"/>
-        <w:rPr>
-          <w:lang w:val="vi-VN"/>
-        </w:rPr>
-      </w:pPr>
-      <w:r>
-        <w:lastRenderedPageBreak/>
-        <w:t>Bảng taikhoantindung_log thực hiện ghi log các thao tác thay đổi thông tin tài khoản tín dụng, lưu trữ history các hạn mức cũ, mới, số nợ cũ, mới.</w:t>
-      </w:r>
-    </w:p>
-    <w:p>
-      <w:pPr>
-        <w:pStyle w:val="BT"/>
-        <w:jc w:val="center"/>
-        <w:rPr>
-          <w:lang w:val="vi-VN"/>
-        </w:rPr>
+        <w:pStyle w:val="-G1"/>
+      </w:pPr>
+      <w:r>
+        <w:t>Chức năng báo cáo nợ tín dụng:</w:t>
+      </w:r>
+    </w:p>
+    <w:p>
+      <w:pPr>
+        <w:pStyle w:val="-G1"/>
+        <w:numPr>
+          <w:ilvl w:val="0"/>
+          <w:numId w:val="0"/>
+        </w:numPr>
       </w:pPr>
       <w:r>
         <w:rPr>
           <w:noProof/>
         </w:rPr>
         <w:drawing>
-          <wp:inline distT="0" distB="0" distL="0" distR="0" wp14:anchorId="426F2AA6" wp14:editId="3DC404D6">
-            <wp:extent cx="2181225" cy="3581400"/>
-            <wp:effectExtent l="0" t="0" r="9525" b="0"/>
-            <wp:docPr id="23" name="Picture 23"/>
+          <wp:inline distT="0" distB="0" distL="0" distR="0" wp14:anchorId="40BBEE5A" wp14:editId="14676C75">
+            <wp:extent cx="5760720" cy="3315335"/>
+            <wp:effectExtent l="0" t="0" r="0" b="0"/>
+            <wp:docPr id="51" name="Picture 51"/>
             <wp:cNvGraphicFramePr>
               <a:graphicFrameLocks xmlns:a="http://schemas.openxmlformats.org/drawingml/2006/main" noChangeAspect="1"/>
             </wp:cNvGraphicFramePr>
@@ -2760,7 +2497,7 @@
                   <pic:spPr>
                     <a:xfrm>
                       <a:off x="0" y="0"/>
-                      <a:ext cx="2181225" cy="3581400"/>
+                      <a:ext cx="5760720" cy="3315335"/>
                     </a:xfrm>
                     <a:prstGeom prst="rect">
                       <a:avLst/>
@@ -2775,80 +2512,30 @@
     </w:p>
     <w:p>
       <w:pPr>
-        <w:pStyle w:val="BT"/>
-        <w:jc w:val="center"/>
-        <w:rPr>
-          <w:bCs/>
-          <w:i/>
-          <w:iCs/>
-        </w:rPr>
-      </w:pPr>
-      <w:r>
-        <w:rPr>
-          <w:bCs/>
-          <w:i/>
-          <w:iCs/>
-        </w:rPr>
-        <w:t xml:space="preserve">Hình </w:t>
-      </w:r>
-      <w:r>
-        <w:rPr>
-          <w:bCs/>
-          <w:i/>
-          <w:iCs/>
-        </w:rPr>
-        <w:t>17</w:t>
-      </w:r>
-      <w:r>
-        <w:rPr>
-          <w:bCs/>
-          <w:i/>
-          <w:iCs/>
-        </w:rPr>
-        <w:t>.</w:t>
-      </w:r>
-      <w:r>
-        <w:rPr>
-          <w:bCs/>
-          <w:i/>
-          <w:iCs/>
-        </w:rPr>
-        <w:t xml:space="preserve"> Bảng </w:t>
-      </w:r>
-      <w:r>
-        <w:rPr>
-          <w:bCs/>
-          <w:i/>
-          <w:iCs/>
-        </w:rPr>
-        <w:t>log giao dịch cá nhân</w:t>
-      </w:r>
-    </w:p>
-    <w:p>
-      <w:pPr>
-        <w:pStyle w:val="BT"/>
-      </w:pPr>
-      <w:r>
-        <w:t>Bảng ghi log thao tác thay đổi thông tin giao dịch cá nhân, lưu trữ history cho việc truy vết giao dịch.</w:t>
-      </w:r>
-    </w:p>
-    <w:p>
-      <w:pPr>
-        <w:pStyle w:val="BT"/>
-        <w:jc w:val="center"/>
-        <w:rPr>
-          <w:lang w:val="vi-VN"/>
-        </w:rPr>
+        <w:pStyle w:val="-G1"/>
+      </w:pPr>
+      <w:r>
+        <w:t>Chức năng báo cáo tín dụng:</w:t>
+      </w:r>
+    </w:p>
+    <w:p>
+      <w:pPr>
+        <w:pStyle w:val="-G1"/>
+        <w:numPr>
+          <w:ilvl w:val="0"/>
+          <w:numId w:val="0"/>
+        </w:numPr>
       </w:pPr>
       <w:r>
         <w:rPr>
           <w:noProof/>
         </w:rPr>
+        <w:lastRenderedPageBreak/>
         <w:drawing>
-          <wp:inline distT="0" distB="0" distL="0" distR="0" wp14:anchorId="23FA5A1D" wp14:editId="565FD23E">
-            <wp:extent cx="2324100" cy="2619375"/>
-            <wp:effectExtent l="0" t="0" r="0" b="9525"/>
-            <wp:docPr id="24" name="Picture 24"/>
+          <wp:inline distT="0" distB="0" distL="0" distR="0" wp14:anchorId="022FEBEE" wp14:editId="3A9F0FE4">
+            <wp:extent cx="5760720" cy="3305810"/>
+            <wp:effectExtent l="0" t="0" r="0" b="8890"/>
+            <wp:docPr id="52" name="Picture 52"/>
             <wp:cNvGraphicFramePr>
               <a:graphicFrameLocks xmlns:a="http://schemas.openxmlformats.org/drawingml/2006/main" noChangeAspect="1"/>
             </wp:cNvGraphicFramePr>
@@ -2868,7 +2555,7 @@
                   <pic:spPr>
                     <a:xfrm>
                       <a:off x="0" y="0"/>
-                      <a:ext cx="2324100" cy="2619375"/>
+                      <a:ext cx="5760720" cy="3305810"/>
                     </a:xfrm>
                     <a:prstGeom prst="rect">
                       <a:avLst/>
@@ -2883,81 +2570,29 @@
     </w:p>
     <w:p>
       <w:pPr>
-        <w:pStyle w:val="BT"/>
-        <w:jc w:val="center"/>
-        <w:rPr>
-          <w:bCs/>
-          <w:i/>
-          <w:iCs/>
-        </w:rPr>
-      </w:pPr>
-      <w:r>
-        <w:rPr>
-          <w:bCs/>
-          <w:i/>
-          <w:iCs/>
-        </w:rPr>
-        <w:t xml:space="preserve">Hình </w:t>
-      </w:r>
-      <w:r>
-        <w:rPr>
-          <w:bCs/>
-          <w:i/>
-          <w:iCs/>
-        </w:rPr>
-        <w:t>18</w:t>
-      </w:r>
-      <w:r>
-        <w:rPr>
-          <w:bCs/>
-          <w:i/>
-          <w:iCs/>
-        </w:rPr>
-        <w:t>.</w:t>
-      </w:r>
-      <w:r>
-        <w:rPr>
-          <w:bCs/>
-          <w:i/>
-          <w:iCs/>
-        </w:rPr>
-        <w:t xml:space="preserve"> Bảng </w:t>
-      </w:r>
-      <w:r>
-        <w:rPr>
-          <w:bCs/>
-          <w:i/>
-          <w:iCs/>
-        </w:rPr>
-        <w:t>log khách hàng cá nhân</w:t>
-      </w:r>
-    </w:p>
-    <w:p>
-      <w:pPr>
-        <w:pStyle w:val="BT"/>
-      </w:pPr>
-      <w:r>
-        <w:t>Bảng lưu thông tin history của khách hàng cá nhân, lưu các lần thay đổi, các thông tin nghề nghiệp, thu nhập mới cũ.</w:t>
-      </w:r>
-    </w:p>
-    <w:p>
-      <w:pPr>
-        <w:pStyle w:val="BT"/>
-        <w:jc w:val="center"/>
-        <w:rPr>
-          <w:lang w:val="vi-VN"/>
-        </w:rPr>
+        <w:pStyle w:val="-G1"/>
+      </w:pPr>
+      <w:r>
+        <w:t>Chức năng báo cáo tổng tiền gửi:</w:t>
+      </w:r>
+    </w:p>
+    <w:p>
+      <w:pPr>
+        <w:pStyle w:val="-G1"/>
+        <w:numPr>
+          <w:ilvl w:val="0"/>
+          <w:numId w:val="0"/>
+        </w:numPr>
       </w:pPr>
       <w:r>
         <w:rPr>
           <w:noProof/>
         </w:rPr>
-        <w:lastRenderedPageBreak/>
         <w:drawing>
-          <wp:inline distT="0" distB="0" distL="0" distR="0" wp14:anchorId="351167D8" wp14:editId="61570F3C">
-            <wp:extent cx="1932167" cy="2179411"/>
+          <wp:inline distT="0" distB="0" distL="0" distR="0" wp14:anchorId="73D037FA" wp14:editId="74F6B02A">
+            <wp:extent cx="5760720" cy="3314700"/>
             <wp:effectExtent l="0" t="0" r="0" b="0"/>
-            <wp:docPr id="25" name="Picture 25"/>
+            <wp:docPr id="53" name="Picture 53"/>
             <wp:cNvGraphicFramePr>
               <a:graphicFrameLocks xmlns:a="http://schemas.openxmlformats.org/drawingml/2006/main" noChangeAspect="1"/>
             </wp:cNvGraphicFramePr>
@@ -2977,7 +2612,7 @@
                   <pic:spPr>
                     <a:xfrm>
                       <a:off x="0" y="0"/>
-                      <a:ext cx="1935207" cy="2182840"/>
+                      <a:ext cx="5760720" cy="3314700"/>
                     </a:xfrm>
                     <a:prstGeom prst="rect">
                       <a:avLst/>
@@ -2992,1181 +2627,6 @@
     </w:p>
     <w:p>
       <w:pPr>
-        <w:pStyle w:val="BT"/>
-        <w:jc w:val="center"/>
-        <w:rPr>
-          <w:bCs/>
-          <w:i/>
-          <w:iCs/>
-        </w:rPr>
-      </w:pPr>
-      <w:r>
-        <w:rPr>
-          <w:bCs/>
-          <w:i/>
-          <w:iCs/>
-        </w:rPr>
-        <w:t xml:space="preserve">Hình </w:t>
-      </w:r>
-      <w:r>
-        <w:rPr>
-          <w:bCs/>
-          <w:i/>
-          <w:iCs/>
-        </w:rPr>
-        <w:t>19</w:t>
-      </w:r>
-      <w:r>
-        <w:rPr>
-          <w:bCs/>
-          <w:i/>
-          <w:iCs/>
-        </w:rPr>
-        <w:t>.</w:t>
-      </w:r>
-      <w:r>
-        <w:rPr>
-          <w:bCs/>
-          <w:i/>
-          <w:iCs/>
-        </w:rPr>
-        <w:t xml:space="preserve"> Bảng </w:t>
-      </w:r>
-      <w:r>
-        <w:rPr>
-          <w:bCs/>
-          <w:i/>
-          <w:iCs/>
-        </w:rPr>
-        <w:t>log tài khoản</w:t>
-      </w:r>
-    </w:p>
-    <w:p>
-      <w:pPr>
-        <w:pStyle w:val="BT"/>
-      </w:pPr>
-      <w:r>
-        <w:t>Bảng taikhoan_log lưu trữ thông tin các lần thay đổi thông tin tài khoản, hỗ trợ cho truy vết thay đổi.</w:t>
-      </w:r>
-    </w:p>
-    <w:p>
-      <w:pPr>
-        <w:pStyle w:val="BT"/>
-        <w:jc w:val="center"/>
-        <w:rPr>
-          <w:lang w:val="vi-VN"/>
-        </w:rPr>
-      </w:pPr>
-      <w:r>
-        <w:rPr>
-          <w:noProof/>
-        </w:rPr>
-        <w:drawing>
-          <wp:inline distT="0" distB="0" distL="0" distR="0" wp14:anchorId="0D73E069" wp14:editId="35B9F8E5">
-            <wp:extent cx="2552369" cy="2760541"/>
-            <wp:effectExtent l="0" t="0" r="635" b="1905"/>
-            <wp:docPr id="26" name="Picture 26"/>
-            <wp:cNvGraphicFramePr>
-              <a:graphicFrameLocks xmlns:a="http://schemas.openxmlformats.org/drawingml/2006/main" noChangeAspect="1"/>
-            </wp:cNvGraphicFramePr>
-            <a:graphic xmlns:a="http://schemas.openxmlformats.org/drawingml/2006/main">
-              <a:graphicData uri="http://schemas.openxmlformats.org/drawingml/2006/picture">
-                <pic:pic xmlns:pic="http://schemas.openxmlformats.org/drawingml/2006/picture">
-                  <pic:nvPicPr>
-                    <pic:cNvPr id="1" name=""/>
-                    <pic:cNvPicPr/>
-                  </pic:nvPicPr>
-                  <pic:blipFill>
-                    <a:blip r:embed="rId34"/>
-                    <a:stretch>
-                      <a:fillRect/>
-                    </a:stretch>
-                  </pic:blipFill>
-                  <pic:spPr>
-                    <a:xfrm>
-                      <a:off x="0" y="0"/>
-                      <a:ext cx="2556997" cy="2765546"/>
-                    </a:xfrm>
-                    <a:prstGeom prst="rect">
-                      <a:avLst/>
-                    </a:prstGeom>
-                  </pic:spPr>
-                </pic:pic>
-              </a:graphicData>
-            </a:graphic>
-          </wp:inline>
-        </w:drawing>
-      </w:r>
-    </w:p>
-    <w:p>
-      <w:pPr>
-        <w:pStyle w:val="BT"/>
-        <w:jc w:val="center"/>
-        <w:rPr>
-          <w:bCs/>
-          <w:i/>
-          <w:iCs/>
-        </w:rPr>
-      </w:pPr>
-      <w:r>
-        <w:rPr>
-          <w:bCs/>
-          <w:i/>
-          <w:iCs/>
-        </w:rPr>
-        <w:t xml:space="preserve">Hình </w:t>
-      </w:r>
-      <w:r>
-        <w:rPr>
-          <w:bCs/>
-          <w:i/>
-          <w:iCs/>
-        </w:rPr>
-        <w:t>20</w:t>
-      </w:r>
-      <w:r>
-        <w:rPr>
-          <w:bCs/>
-          <w:i/>
-          <w:iCs/>
-        </w:rPr>
-        <w:t>.</w:t>
-      </w:r>
-      <w:r>
-        <w:rPr>
-          <w:bCs/>
-          <w:i/>
-          <w:iCs/>
-        </w:rPr>
-        <w:t xml:space="preserve"> Bảng </w:t>
-      </w:r>
-      <w:r>
-        <w:rPr>
-          <w:bCs/>
-          <w:i/>
-          <w:iCs/>
-        </w:rPr>
-        <w:t>log sở hữu tổ chức doanh nghiệp</w:t>
-      </w:r>
-    </w:p>
-    <w:p>
-      <w:pPr>
-        <w:pStyle w:val="BT"/>
-      </w:pPr>
-      <w:r>
-        <w:t>Bảng sohuutochucdoanhnghiep_log thực hiện lưu history các thao tác thay đổi thông tin trên bảng sohuutochucdoanhnghiep.</w:t>
-      </w:r>
-    </w:p>
-    <w:p>
-      <w:pPr>
-        <w:pStyle w:val="BT"/>
-        <w:jc w:val="center"/>
-        <w:rPr>
-          <w:lang w:val="vi-VN"/>
-        </w:rPr>
-      </w:pPr>
-      <w:r>
-        <w:rPr>
-          <w:noProof/>
-        </w:rPr>
-        <w:drawing>
-          <wp:inline distT="0" distB="0" distL="0" distR="0" wp14:anchorId="68736243" wp14:editId="472813ED">
-            <wp:extent cx="2679590" cy="2316114"/>
-            <wp:effectExtent l="0" t="0" r="6985" b="8255"/>
-            <wp:docPr id="27" name="Picture 27"/>
-            <wp:cNvGraphicFramePr>
-              <a:graphicFrameLocks xmlns:a="http://schemas.openxmlformats.org/drawingml/2006/main" noChangeAspect="1"/>
-            </wp:cNvGraphicFramePr>
-            <a:graphic xmlns:a="http://schemas.openxmlformats.org/drawingml/2006/main">
-              <a:graphicData uri="http://schemas.openxmlformats.org/drawingml/2006/picture">
-                <pic:pic xmlns:pic="http://schemas.openxmlformats.org/drawingml/2006/picture">
-                  <pic:nvPicPr>
-                    <pic:cNvPr id="1" name=""/>
-                    <pic:cNvPicPr/>
-                  </pic:nvPicPr>
-                  <pic:blipFill>
-                    <a:blip r:embed="rId35"/>
-                    <a:stretch>
-                      <a:fillRect/>
-                    </a:stretch>
-                  </pic:blipFill>
-                  <pic:spPr>
-                    <a:xfrm>
-                      <a:off x="0" y="0"/>
-                      <a:ext cx="2742555" cy="2370538"/>
-                    </a:xfrm>
-                    <a:prstGeom prst="rect">
-                      <a:avLst/>
-                    </a:prstGeom>
-                  </pic:spPr>
-                </pic:pic>
-              </a:graphicData>
-            </a:graphic>
-          </wp:inline>
-        </w:drawing>
-      </w:r>
-    </w:p>
-    <w:p>
-      <w:pPr>
-        <w:pStyle w:val="BT"/>
-        <w:jc w:val="center"/>
-        <w:rPr>
-          <w:bCs/>
-          <w:i/>
-          <w:iCs/>
-        </w:rPr>
-      </w:pPr>
-      <w:r>
-        <w:rPr>
-          <w:bCs/>
-          <w:i/>
-          <w:iCs/>
-        </w:rPr>
-        <w:lastRenderedPageBreak/>
-        <w:t xml:space="preserve">Hình </w:t>
-      </w:r>
-      <w:r>
-        <w:rPr>
-          <w:bCs/>
-          <w:i/>
-          <w:iCs/>
-        </w:rPr>
-        <w:t>21</w:t>
-      </w:r>
-      <w:r>
-        <w:rPr>
-          <w:bCs/>
-          <w:i/>
-          <w:iCs/>
-        </w:rPr>
-        <w:t>.</w:t>
-      </w:r>
-      <w:r>
-        <w:rPr>
-          <w:bCs/>
-          <w:i/>
-          <w:iCs/>
-        </w:rPr>
-        <w:t xml:space="preserve"> Bảng </w:t>
-      </w:r>
-      <w:r>
-        <w:rPr>
-          <w:bCs/>
-          <w:i/>
-          <w:iCs/>
-        </w:rPr>
-        <w:t>log khách hàng tổ chức doanh nghiệp</w:t>
-      </w:r>
-    </w:p>
-    <w:p>
-      <w:pPr>
-        <w:pStyle w:val="BT"/>
-      </w:pPr>
-      <w:r>
-        <w:t>Bảng log khách hàng tổ chức doanh nghiệp lưu trữ thông tin history thao tác trên bảng khachhangtochucdoanhnghiep, hỗ trợ truy vết thao tác.</w:t>
-      </w:r>
-    </w:p>
-    <w:p>
-      <w:pPr>
-        <w:pStyle w:val="BT"/>
-        <w:jc w:val="center"/>
-        <w:rPr>
-          <w:lang w:val="vi-VN"/>
-        </w:rPr>
-      </w:pPr>
-      <w:r>
-        <w:rPr>
-          <w:noProof/>
-        </w:rPr>
-        <w:drawing>
-          <wp:inline distT="0" distB="0" distL="0" distR="0" wp14:anchorId="290EB24C" wp14:editId="33DAD877">
-            <wp:extent cx="1847850" cy="3143250"/>
-            <wp:effectExtent l="0" t="0" r="0" b="0"/>
-            <wp:docPr id="28" name="Picture 28"/>
-            <wp:cNvGraphicFramePr>
-              <a:graphicFrameLocks xmlns:a="http://schemas.openxmlformats.org/drawingml/2006/main" noChangeAspect="1"/>
-            </wp:cNvGraphicFramePr>
-            <a:graphic xmlns:a="http://schemas.openxmlformats.org/drawingml/2006/main">
-              <a:graphicData uri="http://schemas.openxmlformats.org/drawingml/2006/picture">
-                <pic:pic xmlns:pic="http://schemas.openxmlformats.org/drawingml/2006/picture">
-                  <pic:nvPicPr>
-                    <pic:cNvPr id="1" name=""/>
-                    <pic:cNvPicPr/>
-                  </pic:nvPicPr>
-                  <pic:blipFill>
-                    <a:blip r:embed="rId36"/>
-                    <a:stretch>
-                      <a:fillRect/>
-                    </a:stretch>
-                  </pic:blipFill>
-                  <pic:spPr>
-                    <a:xfrm>
-                      <a:off x="0" y="0"/>
-                      <a:ext cx="1847850" cy="3143250"/>
-                    </a:xfrm>
-                    <a:prstGeom prst="rect">
-                      <a:avLst/>
-                    </a:prstGeom>
-                  </pic:spPr>
-                </pic:pic>
-              </a:graphicData>
-            </a:graphic>
-          </wp:inline>
-        </w:drawing>
-      </w:r>
-    </w:p>
-    <w:p>
-      <w:pPr>
-        <w:pStyle w:val="BT"/>
-        <w:jc w:val="center"/>
-        <w:rPr>
-          <w:bCs/>
-          <w:i/>
-          <w:iCs/>
-        </w:rPr>
-      </w:pPr>
-      <w:r>
-        <w:rPr>
-          <w:bCs/>
-          <w:i/>
-          <w:iCs/>
-        </w:rPr>
-        <w:t xml:space="preserve">Hình </w:t>
-      </w:r>
-      <w:r>
-        <w:rPr>
-          <w:bCs/>
-          <w:i/>
-          <w:iCs/>
-        </w:rPr>
-        <w:t>22</w:t>
-      </w:r>
-      <w:r>
-        <w:rPr>
-          <w:bCs/>
-          <w:i/>
-          <w:iCs/>
-        </w:rPr>
-        <w:t>.</w:t>
-      </w:r>
-      <w:r>
-        <w:rPr>
-          <w:bCs/>
-          <w:i/>
-          <w:iCs/>
-        </w:rPr>
-        <w:t xml:space="preserve"> Bảng </w:t>
-      </w:r>
-      <w:r>
-        <w:rPr>
-          <w:bCs/>
-          <w:i/>
-          <w:iCs/>
-        </w:rPr>
-        <w:t>log nhân viên</w:t>
-      </w:r>
-    </w:p>
-    <w:p>
-      <w:pPr>
-        <w:pStyle w:val="BT"/>
-      </w:pPr>
-      <w:r>
-        <w:t>Bảng log nhân viên, lưu thông tin thao tác thay đổi thông tin nhân viên, các thông tin tên, địa chỉ, cấp bậc.</w:t>
-      </w:r>
-    </w:p>
-    <w:p>
-      <w:pPr>
-        <w:pStyle w:val="BT"/>
-        <w:jc w:val="center"/>
-        <w:rPr>
-          <w:lang w:val="vi-VN"/>
-        </w:rPr>
-      </w:pPr>
-      <w:r>
-        <w:rPr>
-          <w:noProof/>
-        </w:rPr>
-        <w:drawing>
-          <wp:inline distT="0" distB="0" distL="0" distR="0" wp14:anchorId="6DAF1250" wp14:editId="705E7308">
-            <wp:extent cx="1943100" cy="2571750"/>
-            <wp:effectExtent l="0" t="0" r="0" b="0"/>
-            <wp:docPr id="29" name="Picture 29"/>
-            <wp:cNvGraphicFramePr>
-              <a:graphicFrameLocks xmlns:a="http://schemas.openxmlformats.org/drawingml/2006/main" noChangeAspect="1"/>
-            </wp:cNvGraphicFramePr>
-            <a:graphic xmlns:a="http://schemas.openxmlformats.org/drawingml/2006/main">
-              <a:graphicData uri="http://schemas.openxmlformats.org/drawingml/2006/picture">
-                <pic:pic xmlns:pic="http://schemas.openxmlformats.org/drawingml/2006/picture">
-                  <pic:nvPicPr>
-                    <pic:cNvPr id="1" name=""/>
-                    <pic:cNvPicPr/>
-                  </pic:nvPicPr>
-                  <pic:blipFill>
-                    <a:blip r:embed="rId37"/>
-                    <a:stretch>
-                      <a:fillRect/>
-                    </a:stretch>
-                  </pic:blipFill>
-                  <pic:spPr>
-                    <a:xfrm>
-                      <a:off x="0" y="0"/>
-                      <a:ext cx="1943100" cy="2571750"/>
-                    </a:xfrm>
-                    <a:prstGeom prst="rect">
-                      <a:avLst/>
-                    </a:prstGeom>
-                  </pic:spPr>
-                </pic:pic>
-              </a:graphicData>
-            </a:graphic>
-          </wp:inline>
-        </w:drawing>
-      </w:r>
-    </w:p>
-    <w:p>
-      <w:pPr>
-        <w:pStyle w:val="BT"/>
-        <w:jc w:val="center"/>
-        <w:rPr>
-          <w:bCs/>
-          <w:i/>
-          <w:iCs/>
-        </w:rPr>
-      </w:pPr>
-      <w:r>
-        <w:rPr>
-          <w:bCs/>
-          <w:i/>
-          <w:iCs/>
-        </w:rPr>
-        <w:t xml:space="preserve">Hình </w:t>
-      </w:r>
-      <w:r>
-        <w:rPr>
-          <w:bCs/>
-          <w:i/>
-          <w:iCs/>
-        </w:rPr>
-        <w:t>23</w:t>
-      </w:r>
-      <w:r>
-        <w:rPr>
-          <w:bCs/>
-          <w:i/>
-          <w:iCs/>
-        </w:rPr>
-        <w:t>.</w:t>
-      </w:r>
-      <w:r>
-        <w:rPr>
-          <w:bCs/>
-          <w:i/>
-          <w:iCs/>
-        </w:rPr>
-        <w:t xml:space="preserve"> Bảng </w:t>
-      </w:r>
-      <w:r>
-        <w:rPr>
-          <w:bCs/>
-          <w:i/>
-          <w:iCs/>
-        </w:rPr>
-        <w:t>log tài khoản gửi tiền</w:t>
-      </w:r>
-    </w:p>
-    <w:p>
-      <w:pPr>
-        <w:pStyle w:val="BT"/>
-      </w:pPr>
-      <w:r>
-        <w:t>Bảng taikhoanguitien_log thực hiện lưu trữ thông tin thao tác cập nhật thông tin trên bảng taikhoanguitien, bao gồm các thông tin: lãi suất, số dư.</w:t>
-      </w:r>
-    </w:p>
-    <w:p>
-      <w:pPr>
-        <w:pStyle w:val="BT"/>
-        <w:jc w:val="center"/>
-        <w:rPr>
-          <w:lang w:val="vi-VN"/>
-        </w:rPr>
-      </w:pPr>
-      <w:r>
-        <w:rPr>
-          <w:noProof/>
-        </w:rPr>
-        <w:lastRenderedPageBreak/>
-        <w:drawing>
-          <wp:inline distT="0" distB="0" distL="0" distR="0" wp14:anchorId="726FF05D" wp14:editId="4B6526BB">
-            <wp:extent cx="2733675" cy="3562350"/>
-            <wp:effectExtent l="0" t="0" r="9525" b="0"/>
-            <wp:docPr id="30" name="Picture 30"/>
-            <wp:cNvGraphicFramePr>
-              <a:graphicFrameLocks xmlns:a="http://schemas.openxmlformats.org/drawingml/2006/main" noChangeAspect="1"/>
-            </wp:cNvGraphicFramePr>
-            <a:graphic xmlns:a="http://schemas.openxmlformats.org/drawingml/2006/main">
-              <a:graphicData uri="http://schemas.openxmlformats.org/drawingml/2006/picture">
-                <pic:pic xmlns:pic="http://schemas.openxmlformats.org/drawingml/2006/picture">
-                  <pic:nvPicPr>
-                    <pic:cNvPr id="1" name=""/>
-                    <pic:cNvPicPr/>
-                  </pic:nvPicPr>
-                  <pic:blipFill>
-                    <a:blip r:embed="rId38"/>
-                    <a:stretch>
-                      <a:fillRect/>
-                    </a:stretch>
-                  </pic:blipFill>
-                  <pic:spPr>
-                    <a:xfrm>
-                      <a:off x="0" y="0"/>
-                      <a:ext cx="2733675" cy="3562350"/>
-                    </a:xfrm>
-                    <a:prstGeom prst="rect">
-                      <a:avLst/>
-                    </a:prstGeom>
-                  </pic:spPr>
-                </pic:pic>
-              </a:graphicData>
-            </a:graphic>
-          </wp:inline>
-        </w:drawing>
-      </w:r>
-    </w:p>
-    <w:p>
-      <w:pPr>
-        <w:pStyle w:val="BT"/>
-        <w:jc w:val="center"/>
-        <w:rPr>
-          <w:bCs/>
-          <w:i/>
-          <w:iCs/>
-        </w:rPr>
-      </w:pPr>
-      <w:r>
-        <w:rPr>
-          <w:bCs/>
-          <w:i/>
-          <w:iCs/>
-        </w:rPr>
-        <w:t xml:space="preserve">Hình </w:t>
-      </w:r>
-      <w:r>
-        <w:rPr>
-          <w:bCs/>
-          <w:i/>
-          <w:iCs/>
-        </w:rPr>
-        <w:t>24</w:t>
-      </w:r>
-      <w:r>
-        <w:rPr>
-          <w:bCs/>
-          <w:i/>
-          <w:iCs/>
-        </w:rPr>
-        <w:t>.</w:t>
-      </w:r>
-      <w:r>
-        <w:rPr>
-          <w:bCs/>
-          <w:i/>
-          <w:iCs/>
-        </w:rPr>
-        <w:t xml:space="preserve"> Bảng </w:t>
-      </w:r>
-      <w:r>
-        <w:rPr>
-          <w:bCs/>
-          <w:i/>
-          <w:iCs/>
-        </w:rPr>
-        <w:t>log giao dịch tổ chức doanh nghiệp</w:t>
-      </w:r>
-    </w:p>
-    <w:p>
-      <w:pPr>
-        <w:pStyle w:val="BT"/>
-      </w:pPr>
-      <w:r>
-        <w:t>Các thao tác cập nhật thông tin trên bảng giaodichtochucdoanhnghiep sẽ được lưu trữ lại trên bảng giaodichtochucdoanhnghiep_log, hỗ trợ truy vết cập nhật dữ liệu, tránh thất thoát giao dịch</w:t>
-      </w:r>
-    </w:p>
-    <w:p>
-      <w:pPr>
-        <w:pStyle w:val="BT"/>
-        <w:jc w:val="center"/>
-        <w:rPr>
-          <w:lang w:val="vi-VN"/>
-        </w:rPr>
-      </w:pPr>
-      <w:r>
-        <w:rPr>
-          <w:noProof/>
-        </w:rPr>
-        <w:drawing>
-          <wp:inline distT="0" distB="0" distL="0" distR="0" wp14:anchorId="028BB306" wp14:editId="445F8D8C">
-            <wp:extent cx="1809750" cy="2114550"/>
-            <wp:effectExtent l="0" t="0" r="0" b="0"/>
-            <wp:docPr id="31" name="Picture 31"/>
-            <wp:cNvGraphicFramePr>
-              <a:graphicFrameLocks xmlns:a="http://schemas.openxmlformats.org/drawingml/2006/main" noChangeAspect="1"/>
-            </wp:cNvGraphicFramePr>
-            <a:graphic xmlns:a="http://schemas.openxmlformats.org/drawingml/2006/main">
-              <a:graphicData uri="http://schemas.openxmlformats.org/drawingml/2006/picture">
-                <pic:pic xmlns:pic="http://schemas.openxmlformats.org/drawingml/2006/picture">
-                  <pic:nvPicPr>
-                    <pic:cNvPr id="1" name=""/>
-                    <pic:cNvPicPr/>
-                  </pic:nvPicPr>
-                  <pic:blipFill>
-                    <a:blip r:embed="rId39"/>
-                    <a:stretch>
-                      <a:fillRect/>
-                    </a:stretch>
-                  </pic:blipFill>
-                  <pic:spPr>
-                    <a:xfrm>
-                      <a:off x="0" y="0"/>
-                      <a:ext cx="1809750" cy="2114550"/>
-                    </a:xfrm>
-                    <a:prstGeom prst="rect">
-                      <a:avLst/>
-                    </a:prstGeom>
-                  </pic:spPr>
-                </pic:pic>
-              </a:graphicData>
-            </a:graphic>
-          </wp:inline>
-        </w:drawing>
-      </w:r>
-    </w:p>
-    <w:p>
-      <w:pPr>
-        <w:pStyle w:val="BT"/>
-        <w:jc w:val="center"/>
-        <w:rPr>
-          <w:bCs/>
-          <w:i/>
-          <w:iCs/>
-        </w:rPr>
-      </w:pPr>
-      <w:r>
-        <w:rPr>
-          <w:bCs/>
-          <w:i/>
-          <w:iCs/>
-        </w:rPr>
-        <w:t xml:space="preserve">Hình </w:t>
-      </w:r>
-      <w:r>
-        <w:rPr>
-          <w:bCs/>
-          <w:i/>
-          <w:iCs/>
-        </w:rPr>
-        <w:t>25</w:t>
-      </w:r>
-      <w:r>
-        <w:rPr>
-          <w:bCs/>
-          <w:i/>
-          <w:iCs/>
-        </w:rPr>
-        <w:t>.</w:t>
-      </w:r>
-      <w:r>
-        <w:rPr>
-          <w:bCs/>
-          <w:i/>
-          <w:iCs/>
-        </w:rPr>
-        <w:t xml:space="preserve"> Bảng </w:t>
-      </w:r>
-      <w:r>
-        <w:rPr>
-          <w:bCs/>
-          <w:i/>
-          <w:iCs/>
-        </w:rPr>
-        <w:t>log số điện thoại nhân viên</w:t>
-      </w:r>
-    </w:p>
-    <w:p>
-      <w:pPr>
-        <w:pStyle w:val="BT"/>
-      </w:pPr>
-      <w:r>
-        <w:t>Bảng log số điện thoại nhân viên lưu trữ thao tác thực hiện thay đổi số điện thoại nhân viên, bao gồm các thông tin: thời gian thao tác, nhân viên thao tác, số đt mới, cũ.</w:t>
-      </w:r>
-    </w:p>
-    <w:p>
-      <w:pPr>
-        <w:pStyle w:val="BT"/>
-        <w:jc w:val="center"/>
-        <w:rPr>
-          <w:lang w:val="vi-VN"/>
-        </w:rPr>
-      </w:pPr>
-      <w:r>
-        <w:rPr>
-          <w:noProof/>
-        </w:rPr>
-        <w:lastRenderedPageBreak/>
-        <w:drawing>
-          <wp:inline distT="0" distB="0" distL="0" distR="0" wp14:anchorId="20C61FB0" wp14:editId="6BBA55A9">
-            <wp:extent cx="1800225" cy="2800350"/>
-            <wp:effectExtent l="0" t="0" r="9525" b="0"/>
-            <wp:docPr id="32" name="Picture 32"/>
-            <wp:cNvGraphicFramePr>
-              <a:graphicFrameLocks xmlns:a="http://schemas.openxmlformats.org/drawingml/2006/main" noChangeAspect="1"/>
-            </wp:cNvGraphicFramePr>
-            <a:graphic xmlns:a="http://schemas.openxmlformats.org/drawingml/2006/main">
-              <a:graphicData uri="http://schemas.openxmlformats.org/drawingml/2006/picture">
-                <pic:pic xmlns:pic="http://schemas.openxmlformats.org/drawingml/2006/picture">
-                  <pic:nvPicPr>
-                    <pic:cNvPr id="1" name=""/>
-                    <pic:cNvPicPr/>
-                  </pic:nvPicPr>
-                  <pic:blipFill>
-                    <a:blip r:embed="rId40"/>
-                    <a:stretch>
-                      <a:fillRect/>
-                    </a:stretch>
-                  </pic:blipFill>
-                  <pic:spPr>
-                    <a:xfrm>
-                      <a:off x="0" y="0"/>
-                      <a:ext cx="1800225" cy="2800350"/>
-                    </a:xfrm>
-                    <a:prstGeom prst="rect">
-                      <a:avLst/>
-                    </a:prstGeom>
-                  </pic:spPr>
-                </pic:pic>
-              </a:graphicData>
-            </a:graphic>
-          </wp:inline>
-        </w:drawing>
-      </w:r>
-    </w:p>
-    <w:p>
-      <w:pPr>
-        <w:pStyle w:val="BT"/>
-        <w:jc w:val="center"/>
-        <w:rPr>
-          <w:bCs/>
-          <w:i/>
-          <w:iCs/>
-        </w:rPr>
-      </w:pPr>
-      <w:r>
-        <w:rPr>
-          <w:bCs/>
-          <w:i/>
-          <w:iCs/>
-        </w:rPr>
-        <w:t xml:space="preserve">Hình </w:t>
-      </w:r>
-      <w:r>
-        <w:rPr>
-          <w:bCs/>
-          <w:i/>
-          <w:iCs/>
-        </w:rPr>
-        <w:t>26</w:t>
-      </w:r>
-      <w:r>
-        <w:rPr>
-          <w:bCs/>
-          <w:i/>
-          <w:iCs/>
-        </w:rPr>
-        <w:t>.</w:t>
-      </w:r>
-      <w:r>
-        <w:rPr>
-          <w:bCs/>
-          <w:i/>
-          <w:iCs/>
-        </w:rPr>
-        <w:t xml:space="preserve"> Bảng </w:t>
-      </w:r>
-      <w:r>
-        <w:rPr>
-          <w:bCs/>
-          <w:i/>
-          <w:iCs/>
-        </w:rPr>
-        <w:t>log sở hữu cá nhân</w:t>
-      </w:r>
-    </w:p>
-    <w:p>
-      <w:pPr>
-        <w:pStyle w:val="BT"/>
-      </w:pPr>
-      <w:r>
-        <w:t>Bảng log sở hữu cá nhân thực hiện lưu trữ thao tác thay đổi thông tin trên bảng sohuucanhan, bao gồm các thông tin: thời gian thay đổi, nhân viên thay đổi, …</w:t>
-      </w:r>
-    </w:p>
-    <w:p>
-      <w:pPr>
-        <w:pStyle w:val="BT"/>
-        <w:jc w:val="center"/>
-        <w:rPr>
-          <w:lang w:val="vi-VN"/>
-        </w:rPr>
-      </w:pPr>
-      <w:r>
-        <w:rPr>
-          <w:noProof/>
-        </w:rPr>
-        <w:drawing>
-          <wp:inline distT="0" distB="0" distL="0" distR="0" wp14:anchorId="66753379" wp14:editId="39448532">
-            <wp:extent cx="1905000" cy="2114550"/>
-            <wp:effectExtent l="0" t="0" r="0" b="0"/>
-            <wp:docPr id="33" name="Picture 33"/>
-            <wp:cNvGraphicFramePr>
-              <a:graphicFrameLocks xmlns:a="http://schemas.openxmlformats.org/drawingml/2006/main" noChangeAspect="1"/>
-            </wp:cNvGraphicFramePr>
-            <a:graphic xmlns:a="http://schemas.openxmlformats.org/drawingml/2006/main">
-              <a:graphicData uri="http://schemas.openxmlformats.org/drawingml/2006/picture">
-                <pic:pic xmlns:pic="http://schemas.openxmlformats.org/drawingml/2006/picture">
-                  <pic:nvPicPr>
-                    <pic:cNvPr id="1" name=""/>
-                    <pic:cNvPicPr/>
-                  </pic:nvPicPr>
-                  <pic:blipFill>
-                    <a:blip r:embed="rId41"/>
-                    <a:stretch>
-                      <a:fillRect/>
-                    </a:stretch>
-                  </pic:blipFill>
-                  <pic:spPr>
-                    <a:xfrm>
-                      <a:off x="0" y="0"/>
-                      <a:ext cx="1905000" cy="2114550"/>
-                    </a:xfrm>
-                    <a:prstGeom prst="rect">
-                      <a:avLst/>
-                    </a:prstGeom>
-                  </pic:spPr>
-                </pic:pic>
-              </a:graphicData>
-            </a:graphic>
-          </wp:inline>
-        </w:drawing>
-      </w:r>
-    </w:p>
-    <w:p>
-      <w:pPr>
-        <w:pStyle w:val="BT"/>
-        <w:jc w:val="center"/>
-        <w:rPr>
-          <w:bCs/>
-          <w:i/>
-          <w:iCs/>
-        </w:rPr>
-      </w:pPr>
-      <w:r>
-        <w:rPr>
-          <w:bCs/>
-          <w:i/>
-          <w:iCs/>
-        </w:rPr>
-        <w:t xml:space="preserve">Hình </w:t>
-      </w:r>
-      <w:r>
-        <w:rPr>
-          <w:bCs/>
-          <w:i/>
-          <w:iCs/>
-        </w:rPr>
-        <w:t>27</w:t>
-      </w:r>
-      <w:r>
-        <w:rPr>
-          <w:bCs/>
-          <w:i/>
-          <w:iCs/>
-        </w:rPr>
-        <w:t>.</w:t>
-      </w:r>
-      <w:r>
-        <w:rPr>
-          <w:bCs/>
-          <w:i/>
-          <w:iCs/>
-        </w:rPr>
-        <w:t xml:space="preserve"> Bảng </w:t>
-      </w:r>
-      <w:r>
-        <w:rPr>
-          <w:bCs/>
-          <w:i/>
-          <w:iCs/>
-        </w:rPr>
-        <w:t>log số điện thoại khách hàng</w:t>
-      </w:r>
-    </w:p>
-    <w:p>
-      <w:pPr>
-        <w:pStyle w:val="BT"/>
-      </w:pPr>
-      <w:r>
-        <w:t>Các thao tác thay đổi thông tin trên bảng số điện thoại khách hàng sẽ được lưu trữ lại trên bảng khachhang_sdt_log để dễ dàng truy vết cập nhật, tránh thất thoát thông tin.</w:t>
-      </w:r>
-    </w:p>
-    <w:p>
-      <w:pPr>
-        <w:pStyle w:val="BT"/>
-        <w:jc w:val="center"/>
-        <w:rPr>
-          <w:lang w:val="vi-VN"/>
-        </w:rPr>
-      </w:pPr>
-      <w:r>
-        <w:rPr>
-          <w:noProof/>
-        </w:rPr>
-        <w:lastRenderedPageBreak/>
-        <w:drawing>
-          <wp:inline distT="0" distB="0" distL="0" distR="0" wp14:anchorId="14B699A5" wp14:editId="3C31178C">
-            <wp:extent cx="1981200" cy="2590800"/>
-            <wp:effectExtent l="0" t="0" r="0" b="0"/>
-            <wp:docPr id="35" name="Picture 35"/>
-            <wp:cNvGraphicFramePr>
-              <a:graphicFrameLocks xmlns:a="http://schemas.openxmlformats.org/drawingml/2006/main" noChangeAspect="1"/>
-            </wp:cNvGraphicFramePr>
-            <a:graphic xmlns:a="http://schemas.openxmlformats.org/drawingml/2006/main">
-              <a:graphicData uri="http://schemas.openxmlformats.org/drawingml/2006/picture">
-                <pic:pic xmlns:pic="http://schemas.openxmlformats.org/drawingml/2006/picture">
-                  <pic:nvPicPr>
-                    <pic:cNvPr id="1" name=""/>
-                    <pic:cNvPicPr/>
-                  </pic:nvPicPr>
-                  <pic:blipFill>
-                    <a:blip r:embed="rId42"/>
-                    <a:stretch>
-                      <a:fillRect/>
-                    </a:stretch>
-                  </pic:blipFill>
-                  <pic:spPr>
-                    <a:xfrm>
-                      <a:off x="0" y="0"/>
-                      <a:ext cx="1981200" cy="2590800"/>
-                    </a:xfrm>
-                    <a:prstGeom prst="rect">
-                      <a:avLst/>
-                    </a:prstGeom>
-                  </pic:spPr>
-                </pic:pic>
-              </a:graphicData>
-            </a:graphic>
-          </wp:inline>
-        </w:drawing>
-      </w:r>
-    </w:p>
-    <w:p>
-      <w:pPr>
-        <w:pStyle w:val="BT"/>
-        <w:jc w:val="center"/>
-        <w:rPr>
-          <w:bCs/>
-          <w:i/>
-          <w:iCs/>
-        </w:rPr>
-      </w:pPr>
-      <w:r>
-        <w:rPr>
-          <w:bCs/>
-          <w:i/>
-          <w:iCs/>
-        </w:rPr>
-        <w:t xml:space="preserve">Hình </w:t>
-      </w:r>
-      <w:r>
-        <w:rPr>
-          <w:bCs/>
-          <w:i/>
-          <w:iCs/>
-        </w:rPr>
-        <w:t>28</w:t>
-      </w:r>
-      <w:r>
-        <w:rPr>
-          <w:bCs/>
-          <w:i/>
-          <w:iCs/>
-        </w:rPr>
-        <w:t>.</w:t>
-      </w:r>
-      <w:r>
-        <w:rPr>
-          <w:bCs/>
-          <w:i/>
-          <w:iCs/>
-        </w:rPr>
-        <w:t xml:space="preserve"> Bảng </w:t>
-      </w:r>
-      <w:r>
-        <w:rPr>
-          <w:bCs/>
-          <w:i/>
-          <w:iCs/>
-        </w:rPr>
-        <w:t>log tài khoản vay tiền</w:t>
-      </w:r>
-    </w:p>
-    <w:p>
-      <w:pPr>
-        <w:pStyle w:val="BT"/>
-      </w:pPr>
-      <w:r>
-        <w:t>Thông tin tài khoản vay tiền khi cập nhật nhật sẽ được lưu log trên bảng taikhoanvaytien_log, bao gồm các thông tin: thời gian thao tác, tài khoản thay đổi, lãi suất, số nợ.</w:t>
-      </w:r>
-    </w:p>
-    <w:p>
-      <w:pPr>
-        <w:pStyle w:val="BT"/>
-        <w:jc w:val="center"/>
-        <w:rPr>
-          <w:lang w:val="vi-VN"/>
-        </w:rPr>
-      </w:pPr>
-      <w:r>
-        <w:rPr>
-          <w:noProof/>
-        </w:rPr>
-        <w:drawing>
-          <wp:inline distT="0" distB="0" distL="0" distR="0" wp14:anchorId="42613013" wp14:editId="257E170E">
-            <wp:extent cx="1819275" cy="2638425"/>
-            <wp:effectExtent l="0" t="0" r="9525" b="9525"/>
-            <wp:docPr id="36" name="Picture 36"/>
-            <wp:cNvGraphicFramePr>
-              <a:graphicFrameLocks xmlns:a="http://schemas.openxmlformats.org/drawingml/2006/main" noChangeAspect="1"/>
-            </wp:cNvGraphicFramePr>
-            <a:graphic xmlns:a="http://schemas.openxmlformats.org/drawingml/2006/main">
-              <a:graphicData uri="http://schemas.openxmlformats.org/drawingml/2006/picture">
-                <pic:pic xmlns:pic="http://schemas.openxmlformats.org/drawingml/2006/picture">
-                  <pic:nvPicPr>
-                    <pic:cNvPr id="1" name=""/>
-                    <pic:cNvPicPr/>
-                  </pic:nvPicPr>
-                  <pic:blipFill>
-                    <a:blip r:embed="rId43"/>
-                    <a:stretch>
-                      <a:fillRect/>
-                    </a:stretch>
-                  </pic:blipFill>
-                  <pic:spPr>
-                    <a:xfrm>
-                      <a:off x="0" y="0"/>
-                      <a:ext cx="1819275" cy="2638425"/>
-                    </a:xfrm>
-                    <a:prstGeom prst="rect">
-                      <a:avLst/>
-                    </a:prstGeom>
-                  </pic:spPr>
-                </pic:pic>
-              </a:graphicData>
-            </a:graphic>
-          </wp:inline>
-        </w:drawing>
-      </w:r>
-    </w:p>
-    <w:p>
-      <w:pPr>
-        <w:pStyle w:val="BT"/>
-        <w:jc w:val="center"/>
-        <w:rPr>
-          <w:bCs/>
-          <w:i/>
-          <w:iCs/>
-        </w:rPr>
-      </w:pPr>
-      <w:r>
-        <w:rPr>
-          <w:bCs/>
-          <w:i/>
-          <w:iCs/>
-        </w:rPr>
-        <w:t xml:space="preserve">Hình </w:t>
-      </w:r>
-      <w:r>
-        <w:rPr>
-          <w:bCs/>
-          <w:i/>
-          <w:iCs/>
-        </w:rPr>
-        <w:t>29</w:t>
-      </w:r>
-      <w:r>
-        <w:rPr>
-          <w:bCs/>
-          <w:i/>
-          <w:iCs/>
-        </w:rPr>
-        <w:t>.</w:t>
-      </w:r>
-      <w:r>
-        <w:rPr>
-          <w:bCs/>
-          <w:i/>
-          <w:iCs/>
-        </w:rPr>
-        <w:t xml:space="preserve"> Bảng </w:t>
-      </w:r>
-      <w:r>
-        <w:rPr>
-          <w:bCs/>
-          <w:i/>
-          <w:iCs/>
-        </w:rPr>
-        <w:t>log khách hàng</w:t>
-      </w:r>
-    </w:p>
-    <w:p>
-      <w:pPr>
-        <w:pStyle w:val="BT"/>
-        <w:rPr>
-          <w:lang w:val="vi-VN"/>
-        </w:rPr>
-      </w:pPr>
-      <w:r>
-        <w:t>Khách hàng khi có thay đổi thông tin sẽ được lưu trữ lại thông tin cũ, để tránh thất thoát dữ liệu, bảng khachhang_log sẽ thực hiện lưu trữ các thao tác cập nhật này.</w:t>
-      </w:r>
-      <w:bookmarkStart w:id="1" w:name="_GoBack"/>
-      <w:bookmarkEnd w:id="1"/>
-    </w:p>
-    <w:p>
-      <w:pPr>
-        <w:pStyle w:val="Heading1"/>
-        <w:rPr>
-          <w:lang w:val="en-US"/>
-        </w:rPr>
-      </w:pPr>
-      <w:r>
-        <w:rPr>
-          <w:lang w:val="en-US"/>
-        </w:rPr>
-        <w:t xml:space="preserve"> </w:t>
-      </w:r>
-      <w:r>
-        <w:rPr>
-          <w:lang w:val="en-US"/>
-        </w:rPr>
-        <w:tab/>
-      </w:r>
-      <w:r>
-        <w:rPr>
-          <w:lang w:val="en-US"/>
-        </w:rPr>
-        <w:t>CHỨC NĂNG HỆ THỐNG</w:t>
-      </w:r>
-    </w:p>
-    <w:p/>
-    <w:p>
-      <w:pPr>
         <w:pStyle w:val="Heading1"/>
       </w:pPr>
       <w:r>
@@ -4179,23 +2639,7 @@
         <w:pStyle w:val="BT"/>
       </w:pPr>
       <w:r>
-        <w:t xml:space="preserve">Tóm tắt lại quá trình và kết quả hiện có. </w:t>
-      </w:r>
-    </w:p>
-    <w:p>
-      <w:pPr>
-        <w:pStyle w:val="BT"/>
-      </w:pPr>
-      <w:r>
-        <w:t>Tóm tắt kết quả đạt được?</w:t>
-      </w:r>
-    </w:p>
-    <w:p>
-      <w:pPr>
-        <w:pStyle w:val="BT"/>
-      </w:pPr>
-      <w:r>
-        <w:t>Viết 10 dòng, hoặc nửa trang.</w:t>
+        <w:t>Nhận xét đề tài ngân hàng là một lĩnh vực khác lớn, trong quá trình làm chúng tôi đã gặp phải nhiều khó khăn như: phân tích quá đi sâu vào quy trình ra khỏi phạm vi đồ án môn học làm gián đoạn quá trình code, chưa hiểu rõ được các đối tượng mà khái niệm mới ảnh hưởng đến timeline phân tích dữ liệu, …</w:t>
       </w:r>
     </w:p>
     <w:p>
@@ -4207,18 +2651,20 @@
         </w:rPr>
       </w:pPr>
       <w:r>
-        <w:rPr>
-          <w:lang w:val="vi-VN"/>
-        </w:rPr>
-        <w:t xml:space="preserve">Viết tốt được </w:t>
-      </w:r>
-      <w:r>
-        <w:rPr>
-          <w:b/>
-          <w:highlight w:val="yellow"/>
-          <w:lang w:val="vi-VN"/>
-        </w:rPr>
-        <w:t>2 điểm</w:t>
+        <w:t>Nhưng đây cũng là một đề tài không mới cho nên nguồn tài liệu tham khảo, hướng dẫn giúp chúng tôi đảm bảo được hoàn thành các chức năng cơ bản cho đề</w:t>
+      </w:r>
+      <w:r>
+        <w:t xml:space="preserve"> tài này. Chúng tôi đã hoàn thành được các chức năng cơ bản nhất như quản lý khách hàng, quản </w:t>
+      </w:r>
+      <w:r>
+        <w:lastRenderedPageBreak/>
+        <w:t>lý tài khoản, giao dịch, quản lý nhân viên, … Thiết kế cơ sở dữ liệu ngân hàng có thể đáp ứng yêu cầu mở rộng và phát triển sau này.</w:t>
+      </w:r>
+      <w:r>
+        <w:t xml:space="preserve"> </w:t>
+      </w:r>
+      <w:r>
+        <w:t>Qua đề tài này cũng giúp chúng tôi hiểu rõ hơn về các nghiệp vụ tại các ngân hàng, cũng như quy trình để phát triển một ứng dụng cho doanh nghiệp.</w:t>
       </w:r>
     </w:p>
     <w:p>
@@ -4234,26 +2680,9 @@
           <w:b/>
           <w:szCs w:val="26"/>
         </w:rPr>
-      </w:pPr>
-      <w:r>
-        <w:rPr>
-          <w:b/>
-          <w:szCs w:val="26"/>
-        </w:rPr>
-        <w:t>CHÚ Ý:  Viết tối đa 10 trang, không tính trang bìa, TLTK, phụ lục</w:t>
-      </w:r>
-    </w:p>
-    <w:p>
-      <w:pPr>
-        <w:spacing w:after="160" w:line="259" w:lineRule="auto"/>
-        <w:jc w:val="left"/>
-        <w:rPr>
-          <w:b/>
-          <w:szCs w:val="26"/>
-        </w:rPr>
         <w:sectPr>
-          <w:headerReference w:type="default" r:id="rId44"/>
-          <w:footerReference w:type="default" r:id="rId45"/>
+          <w:headerReference w:type="default" r:id="rId34"/>
+          <w:footerReference w:type="default" r:id="rId35"/>
           <w:type w:val="continuous"/>
           <w:pgSz w:w="11907" w:h="16840" w:code="9"/>
           <w:pgMar w:top="1440" w:right="1134" w:bottom="1440" w:left="1701" w:header="709" w:footer="709" w:gutter="0"/>
@@ -4283,128 +2712,110 @@
         <w:lastRenderedPageBreak/>
         <w:t>TÀI LIỆU THAM KHẢO</w:t>
       </w:r>
-      <w:r>
-        <w:rPr>
-          <w:b/>
-          <w:sz w:val="32"/>
-          <w:szCs w:val="32"/>
+    </w:p>
+    <w:p>
+      <w:pPr>
+        <w:pStyle w:val="TLTK"/>
+        <w:rPr>
           <w:lang w:val="vi-VN"/>
         </w:rPr>
-        <w:br/>
-      </w:r>
-      <w:r>
-        <w:rPr>
-          <w:b/>
-          <w:sz w:val="32"/>
-          <w:szCs w:val="32"/>
-        </w:rPr>
-        <w:t>(Không bắt buộc theo chuẩn quốc tế)</w:t>
-      </w:r>
-    </w:p>
-    <w:p>
-      <w:pPr>
-        <w:pStyle w:val="TLTK"/>
-        <w:rPr>
-          <w:lang w:val="vi-VN"/>
-        </w:rPr>
-      </w:pPr>
-      <w:r>
-        <w:rPr>
-          <w:lang w:val="vi-VN"/>
-        </w:rPr>
-        <w:t>Họ và tên tác giả 1, Họ và tên tác giả 2, …, Tên bài tham khảo, năm.</w:t>
-      </w:r>
-    </w:p>
-    <w:p>
-      <w:pPr>
-        <w:pStyle w:val="TLTK"/>
-        <w:rPr>
-          <w:lang w:val="vi-VN"/>
-        </w:rPr>
-      </w:pPr>
-      <w:r>
-        <w:rPr>
-          <w:lang w:val="vi-VN"/>
-        </w:rPr>
-        <w:t>Tên</w:t>
-      </w:r>
-      <w:r>
-        <w:t xml:space="preserve"> bài viết</w:t>
-      </w:r>
-      <w:r>
-        <w:rPr>
-          <w:lang w:val="vi-VN"/>
-        </w:rPr>
-        <w:t xml:space="preserve"> trang web. Link: http:abc.com.vn (Ngày truy cập).</w:t>
-      </w:r>
-      <w:r>
-        <w:t xml:space="preserve"> Đối với tài liệu online </w:t>
-      </w:r>
-      <w:r>
-        <w:rPr>
-          <w:color w:val="FF0000"/>
-        </w:rPr>
-        <w:t>hạn chế/</w:t>
-      </w:r>
-      <w:r>
-        <w:rPr>
-          <w:color w:val="FF0000"/>
-        </w:rPr>
-        <w:t>ko</w:t>
-      </w:r>
-      <w:r>
-        <w:t xml:space="preserve"> tham khảo các blog công nghệ, wikipedia, facebook, youtube, mạng xã hội…</w:t>
-      </w:r>
-    </w:p>
-    <w:p>
-      <w:pPr>
-        <w:pStyle w:val="TLTK"/>
-        <w:rPr>
-          <w:lang w:val="vi-VN"/>
-        </w:rPr>
-      </w:pPr>
-      <w:r>
-        <w:rPr>
-          <w:lang w:val="vi-VN"/>
-        </w:rPr>
-        <w:t>How to create pyspark dataframe with CharType column?</w:t>
-      </w:r>
-      <w:r>
-        <w:t xml:space="preserve">. Link: </w:t>
-      </w:r>
-      <w:hyperlink r:id="rId46" w:history="1">
+      </w:pPr>
+      <w:r>
+        <w:t>Tạo ER Diagram của một Database bằng MySQL Workbench</w:t>
+      </w:r>
+      <w:r>
+        <w:t xml:space="preserve">. Link:  </w:t>
+      </w:r>
+      <w:hyperlink r:id="rId36" w:history="1">
         <w:r>
           <w:rPr>
             <w:rStyle w:val="Hyperlink"/>
           </w:rPr>
-          <w:t>https://stackoverflow.com/questions/76653802/how-to-create-pyspark-dataframe-with-chartype-column</w:t>
+          <w:t>https://viblo.asia/p/tao-er-diagram-cua-mot-database-bang-mysql-workbench-OeVKBqvy5kW</w:t>
         </w:r>
       </w:hyperlink>
-      <w:r>
-        <w:t xml:space="preserve"> (Ngày truy cập 10/7/2023)</w:t>
-      </w:r>
-    </w:p>
-    <w:p/>
-    <w:p>
-      <w:r>
-        <w:t xml:space="preserve">Trình bày không đúng style TLTK </w:t>
-      </w:r>
-      <w:r>
-        <w:rPr>
-          <w:b/>
-          <w:bCs/>
-          <w:color w:val="FF0000"/>
-          <w:highlight w:val="yellow"/>
-        </w:rPr>
-        <w:t>– 1 điểm</w:t>
-      </w:r>
-      <w:r>
-        <w:t>.</w:t>
-      </w:r>
-    </w:p>
-    <w:p>
-      <w:r>
-        <w:t>Chú ý: Đây là cách trình bày TLTK rút gọn, KHÔNG dùng phương pháp này trình bày TLTK cho khóa luận tốt nghiệp hoặc môn học khác.</w:t>
+    </w:p>
+    <w:p>
+      <w:pPr>
+        <w:pStyle w:val="TLTK"/>
+        <w:rPr>
+          <w:lang w:val="vi-VN"/>
+        </w:rPr>
+      </w:pPr>
+      <w:r>
+        <w:t>How to install/run Qt Designer</w:t>
+      </w:r>
+      <w:r>
+        <w:t xml:space="preserve">. Link: </w:t>
+      </w:r>
+      <w:hyperlink r:id="rId37" w:history="1">
+        <w:r>
+          <w:rPr>
+            <w:rStyle w:val="Hyperlink"/>
+          </w:rPr>
+          <w:t>https://stackoverflow.com/questions/42090739/pyqt5-how-to-install-run-qt-designer</w:t>
+        </w:r>
+      </w:hyperlink>
+    </w:p>
+    <w:p>
+      <w:pPr>
+        <w:pStyle w:val="TLTK"/>
+        <w:rPr>
+          <w:lang w:val="vi-VN"/>
+        </w:rPr>
+      </w:pPr>
+      <w:r>
+        <w:t>Creating PyQt Layouts for GUI Python Applications</w:t>
+      </w:r>
+      <w:r>
+        <w:t xml:space="preserve">. Link: </w:t>
+      </w:r>
+      <w:hyperlink r:id="rId38" w:history="1">
+        <w:r>
+          <w:rPr>
+            <w:rStyle w:val="Hyperlink"/>
+          </w:rPr>
+          <w:t>https://www.youtube.com/watch?v=MY29YV9Wk7I</w:t>
+        </w:r>
+      </w:hyperlink>
+    </w:p>
+    <w:p>
+      <w:pPr>
+        <w:pStyle w:val="TLTK"/>
+        <w:rPr>
+          <w:lang w:val="vi-VN"/>
+        </w:rPr>
+      </w:pPr>
+      <w:r>
+        <w:t>How to Automatically Resize Buttons When Change Window Size | Python PyQt5 Tutorial</w:t>
+      </w:r>
+      <w:r>
+        <w:t xml:space="preserve">. Link: </w:t>
+      </w:r>
+      <w:hyperlink r:id="rId39" w:history="1">
+        <w:r>
+          <w:rPr>
+            <w:rStyle w:val="Hyperlink"/>
+          </w:rPr>
+          <w:t>https://www.youtube.com/watch?v=Y-8N1dPFsVE</w:t>
+        </w:r>
+      </w:hyperlink>
+    </w:p>
+    <w:p>
+      <w:pPr>
+        <w:pStyle w:val="TLTK"/>
+        <w:rPr>
+          <w:lang w:val="vi-VN"/>
+        </w:rPr>
+      </w:pPr>
+      <w:r>
+        <w:t>[pyQT5 + Python] Hướng dẫn QT Designer||Chuyển form thiết kế ứng dụng với python.</w:t>
+      </w:r>
+      <w:r>
+        <w:t xml:space="preserve"> Link: </w:t>
+      </w:r>
+      <w:r>
+        <w:t>https://www.youtube.com/watch?v=4Bk1UyEt_Dw</w:t>
       </w:r>
     </w:p>
     <w:p>
@@ -4557,6 +2968,9 @@
             <w:pPr>
               <w:spacing w:before="60" w:after="0" w:line="276" w:lineRule="auto"/>
             </w:pPr>
+            <w:r>
+              <w:t>Võ Tấn Hoàng</w:t>
+            </w:r>
           </w:p>
         </w:tc>
         <w:tc>
@@ -4567,6 +2981,52 @@
             <w:pPr>
               <w:spacing w:before="60" w:after="0" w:line="276" w:lineRule="auto"/>
             </w:pPr>
+            <w:r>
+              <w:t xml:space="preserve">Phân tích thiết kế </w:t>
+            </w:r>
+            <w:r>
+              <w:t>cơ sở dữ liệu</w:t>
+            </w:r>
+          </w:p>
+          <w:p>
+            <w:pPr>
+              <w:spacing w:before="60" w:after="0" w:line="276" w:lineRule="auto"/>
+            </w:pPr>
+            <w:r>
+              <w:t>Phân tích quy trình phát triển, chia task cho các thành viên</w:t>
+            </w:r>
+          </w:p>
+          <w:p>
+            <w:pPr>
+              <w:spacing w:before="60" w:after="0" w:line="276" w:lineRule="auto"/>
+            </w:pPr>
+            <w:r>
+              <w:t>Triển khai thiết kế cấu trúc source code</w:t>
+            </w:r>
+          </w:p>
+          <w:p>
+            <w:pPr>
+              <w:spacing w:before="60" w:after="0" w:line="276" w:lineRule="auto"/>
+            </w:pPr>
+            <w:r>
+              <w:t>Code các chức năng chính</w:t>
+            </w:r>
+          </w:p>
+          <w:p>
+            <w:pPr>
+              <w:spacing w:before="60" w:after="0" w:line="276" w:lineRule="auto"/>
+            </w:pPr>
+            <w:r>
+              <w:t>Research fix lỗi chức năng</w:t>
+            </w:r>
+          </w:p>
+          <w:p>
+            <w:pPr>
+              <w:spacing w:before="60" w:after="0" w:line="276" w:lineRule="auto"/>
+            </w:pPr>
+            <w:r>
+              <w:t>Tham gia làm báo cáo</w:t>
+            </w:r>
           </w:p>
         </w:tc>
       </w:tr>
@@ -4609,6 +3069,28 @@
             <w:pPr>
               <w:spacing w:before="60" w:after="0" w:line="276" w:lineRule="auto"/>
             </w:pPr>
+            <w:r>
+              <w:t>Code các chứ</w:t>
+            </w:r>
+            <w:r>
+              <w:t>c năng report</w:t>
+            </w:r>
+          </w:p>
+          <w:p>
+            <w:pPr>
+              <w:spacing w:before="60" w:after="0" w:line="276" w:lineRule="auto"/>
+            </w:pPr>
+            <w:r>
+              <w:t>Tham gia phân tích thiết kế cơ sở dữ liệu</w:t>
+            </w:r>
+          </w:p>
+          <w:p>
+            <w:pPr>
+              <w:spacing w:before="60" w:after="0" w:line="276" w:lineRule="auto"/>
+            </w:pPr>
+            <w:r>
+              <w:t>Làm báo cáo đề tài + Quay video báo cáo</w:t>
+            </w:r>
           </w:p>
         </w:tc>
       </w:tr>
@@ -4651,491 +3133,41 @@
             <w:pPr>
               <w:spacing w:before="60" w:after="0" w:line="276" w:lineRule="auto"/>
             </w:pPr>
+            <w:r>
+              <w:t>Tham gia phân tích thiết kế cơ sở dữ liệu</w:t>
+            </w:r>
+          </w:p>
+          <w:p>
+            <w:pPr>
+              <w:spacing w:before="60" w:after="0" w:line="276" w:lineRule="auto"/>
+            </w:pPr>
+            <w:r>
+              <w:t>Thiết kế giao diện người dùng</w:t>
+            </w:r>
+            <w:r>
+              <w:t>, code tổ chức giao diện</w:t>
+            </w:r>
+          </w:p>
+          <w:p>
+            <w:pPr>
+              <w:spacing w:before="60" w:after="0" w:line="276" w:lineRule="auto"/>
+            </w:pPr>
+            <w:r>
+              <w:t>Tham gia làm file PowerPoint</w:t>
+            </w:r>
+          </w:p>
+          <w:p>
+            <w:pPr>
+              <w:spacing w:before="60" w:after="0" w:line="276" w:lineRule="auto"/>
+            </w:pPr>
+            <w:r>
+              <w:t>Quản lý task và timeline cho team</w:t>
+            </w:r>
           </w:p>
         </w:tc>
       </w:tr>
     </w:tbl>
     <w:p/>
-    <w:p>
-      <w:pPr>
-        <w:rPr>
-          <w:b/>
-          <w:i/>
-          <w:color w:val="FF0000"/>
-          <w:lang w:val="vi-VN"/>
-        </w:rPr>
-      </w:pPr>
-      <w:r>
-        <w:rPr>
-          <w:b/>
-          <w:i/>
-          <w:color w:val="FF0000"/>
-          <w:highlight w:val="yellow"/>
-          <w:lang w:val="vi-VN"/>
-        </w:rPr>
-        <w:t>(Chú ý: Ghi rõ từng nhiệm vụ chi tiết của mỗi thành viên).</w:t>
-      </w:r>
-    </w:p>
-    <w:p>
-      <w:pPr>
-        <w:rPr>
-          <w:bCs/>
-          <w:iCs/>
-          <w:color w:val="000000" w:themeColor="text1"/>
-          <w:lang w:val="vi-VN"/>
-        </w:rPr>
-      </w:pPr>
-      <w:r>
-        <w:rPr>
-          <w:bCs/>
-          <w:iCs/>
-          <w:color w:val="000000" w:themeColor="text1"/>
-          <w:lang w:val="vi-VN"/>
-        </w:rPr>
-        <w:t>Khi làm bài thu hoạch SV phải thực hiện đúng các quy định sau:</w:t>
-      </w:r>
-    </w:p>
-    <w:p>
-      <w:pPr>
-        <w:pStyle w:val="ListParagraph"/>
-        <w:numPr>
-          <w:ilvl w:val="0"/>
-          <w:numId w:val="11"/>
-        </w:numPr>
-        <w:rPr>
-          <w:bCs/>
-          <w:iCs/>
-          <w:color w:val="000000" w:themeColor="text1"/>
-          <w:lang w:val="vi-VN"/>
-        </w:rPr>
-      </w:pPr>
-      <w:r>
-        <w:rPr>
-          <w:bCs/>
-          <w:iCs/>
-          <w:color w:val="000000" w:themeColor="text1"/>
-          <w:lang w:val="vi-VN"/>
-        </w:rPr>
-        <w:t xml:space="preserve">Sử đụng đúng Template </w:t>
-      </w:r>
-      <w:r>
-        <w:rPr>
-          <w:bCs/>
-          <w:iCs/>
-          <w:color w:val="000000" w:themeColor="text1"/>
-        </w:rPr>
-        <w:t>này</w:t>
-      </w:r>
-      <w:r>
-        <w:rPr>
-          <w:bCs/>
-          <w:iCs/>
-          <w:color w:val="000000" w:themeColor="text1"/>
-          <w:lang w:val="vi-VN"/>
-        </w:rPr>
-        <w:t>.</w:t>
-      </w:r>
-      <w:r>
-        <w:rPr>
-          <w:bCs/>
-          <w:iCs/>
-          <w:color w:val="000000" w:themeColor="text1"/>
-        </w:rPr>
-        <w:t xml:space="preserve"> Không đúng thì </w:t>
-      </w:r>
-      <w:r>
-        <w:rPr>
-          <w:b/>
-          <w:iCs/>
-          <w:color w:val="FF0000"/>
-          <w:highlight w:val="yellow"/>
-        </w:rPr>
-        <w:t>– 2 điểm</w:t>
-      </w:r>
-      <w:r>
-        <w:rPr>
-          <w:bCs/>
-          <w:iCs/>
-          <w:color w:val="000000" w:themeColor="text1"/>
-        </w:rPr>
-        <w:t>.</w:t>
-      </w:r>
-      <w:r>
-        <w:rPr>
-          <w:bCs/>
-          <w:iCs/>
-          <w:color w:val="000000" w:themeColor="text1"/>
-        </w:rPr>
-        <w:t xml:space="preserve"> Chú ý: trong mẫu không có ……</w:t>
-      </w:r>
-    </w:p>
-    <w:p>
-      <w:pPr>
-        <w:pStyle w:val="ListParagraph"/>
-        <w:numPr>
-          <w:ilvl w:val="0"/>
-          <w:numId w:val="11"/>
-        </w:numPr>
-        <w:rPr>
-          <w:bCs/>
-          <w:iCs/>
-          <w:color w:val="000000" w:themeColor="text1"/>
-          <w:lang w:val="vi-VN"/>
-        </w:rPr>
-      </w:pPr>
-      <w:r>
-        <w:rPr>
-          <w:bCs/>
-          <w:iCs/>
-          <w:color w:val="000000" w:themeColor="text1"/>
-          <w:lang w:val="vi-VN"/>
-        </w:rPr>
-        <w:t xml:space="preserve">Copy y chan trên Internet thì gọi là đạo văn và </w:t>
-      </w:r>
-      <w:r>
-        <w:rPr>
-          <w:b/>
-          <w:iCs/>
-          <w:color w:val="FF0000"/>
-          <w:highlight w:val="yellow"/>
-          <w:lang w:val="vi-VN"/>
-        </w:rPr>
-        <w:t>nhận 0 điểm</w:t>
-      </w:r>
-      <w:r>
-        <w:rPr>
-          <w:bCs/>
-          <w:iCs/>
-          <w:color w:val="FF0000"/>
-          <w:lang w:val="vi-VN"/>
-        </w:rPr>
-        <w:t xml:space="preserve"> </w:t>
-      </w:r>
-      <w:r>
-        <w:rPr>
-          <w:bCs/>
-          <w:iCs/>
-          <w:color w:val="000000" w:themeColor="text1"/>
-          <w:lang w:val="vi-VN"/>
-        </w:rPr>
-        <w:t>cho bài thu hoạch.</w:t>
-      </w:r>
-    </w:p>
-    <w:p>
-      <w:pPr>
-        <w:pStyle w:val="ListParagraph"/>
-        <w:numPr>
-          <w:ilvl w:val="0"/>
-          <w:numId w:val="11"/>
-        </w:numPr>
-        <w:rPr>
-          <w:bCs/>
-          <w:iCs/>
-          <w:color w:val="000000" w:themeColor="text1"/>
-          <w:lang w:val="vi-VN"/>
-        </w:rPr>
-      </w:pPr>
-      <w:r>
-        <w:rPr>
-          <w:bCs/>
-          <w:iCs/>
-          <w:color w:val="000000" w:themeColor="text1"/>
-          <w:lang w:val="vi-VN"/>
-        </w:rPr>
-        <w:t xml:space="preserve">Nộp </w:t>
-      </w:r>
-      <w:r>
-        <w:rPr>
-          <w:bCs/>
-          <w:iCs/>
-          <w:color w:val="000000" w:themeColor="text1"/>
-        </w:rPr>
-        <w:t>đúng hạn theo thông báo của GV</w:t>
-      </w:r>
-      <w:r>
-        <w:rPr>
-          <w:bCs/>
-          <w:iCs/>
-          <w:color w:val="000000" w:themeColor="text1"/>
-          <w:lang w:val="vi-VN"/>
-        </w:rPr>
-        <w:t>.</w:t>
-      </w:r>
-    </w:p>
-    <w:p>
-      <w:pPr>
-        <w:pStyle w:val="ListParagraph"/>
-        <w:numPr>
-          <w:ilvl w:val="0"/>
-          <w:numId w:val="11"/>
-        </w:numPr>
-        <w:rPr>
-          <w:bCs/>
-          <w:iCs/>
-          <w:color w:val="000000" w:themeColor="text1"/>
-          <w:lang w:val="vi-VN"/>
-        </w:rPr>
-      </w:pPr>
-      <w:r>
-        <w:rPr>
-          <w:bCs/>
-          <w:iCs/>
-          <w:color w:val="FF0000"/>
-        </w:rPr>
-        <w:t xml:space="preserve">Không trình bày code </w:t>
-      </w:r>
-      <w:r>
-        <w:rPr>
-          <w:bCs/>
-          <w:iCs/>
-          <w:color w:val="000000" w:themeColor="text1"/>
-        </w:rPr>
-        <w:t>trong</w:t>
-      </w:r>
-      <w:r>
-        <w:rPr>
-          <w:bCs/>
-          <w:iCs/>
-          <w:color w:val="000000" w:themeColor="text1"/>
-        </w:rPr>
-        <w:t xml:space="preserve"> nội dung</w:t>
-      </w:r>
-      <w:r>
-        <w:rPr>
-          <w:bCs/>
-          <w:iCs/>
-          <w:color w:val="000000" w:themeColor="text1"/>
-        </w:rPr>
-        <w:t xml:space="preserve"> bài thu hoạch.</w:t>
-      </w:r>
-      <w:r>
-        <w:rPr>
-          <w:bCs/>
-          <w:iCs/>
-          <w:color w:val="000000" w:themeColor="text1"/>
-        </w:rPr>
-        <w:t xml:space="preserve"> Nếu</w:t>
-      </w:r>
-      <w:r>
-        <w:rPr>
-          <w:bCs/>
-          <w:iCs/>
-          <w:color w:val="000000" w:themeColor="text1"/>
-        </w:rPr>
-        <w:t xml:space="preserve"> muốn thì</w:t>
-      </w:r>
-      <w:r>
-        <w:rPr>
-          <w:bCs/>
-          <w:iCs/>
-          <w:color w:val="000000" w:themeColor="text1"/>
-        </w:rPr>
-        <w:t xml:space="preserve"> trình</w:t>
-      </w:r>
-      <w:r>
-        <w:rPr>
-          <w:bCs/>
-          <w:iCs/>
-          <w:color w:val="000000" w:themeColor="text1"/>
-        </w:rPr>
-        <w:t xml:space="preserve"> bày tại phụ lục.</w:t>
-      </w:r>
-    </w:p>
-    <w:p>
-      <w:pPr>
-        <w:rPr>
-          <w:bCs/>
-          <w:iCs/>
-          <w:color w:val="FF0000"/>
-        </w:rPr>
-      </w:pPr>
-    </w:p>
-    <w:p>
-      <w:pPr>
-        <w:rPr>
-          <w:bCs/>
-          <w:iCs/>
-          <w:color w:val="FF0000"/>
-        </w:rPr>
-      </w:pPr>
-      <w:r>
-        <w:rPr>
-          <w:bCs/>
-          <w:iCs/>
-          <w:color w:val="FF0000"/>
-        </w:rPr>
-        <w:t>Sản phẩm:</w:t>
-      </w:r>
-    </w:p>
-    <w:p>
-      <w:pPr>
-        <w:pStyle w:val="ListParagraph"/>
-        <w:numPr>
-          <w:ilvl w:val="0"/>
-          <w:numId w:val="14"/>
-        </w:numPr>
-        <w:rPr>
-          <w:bCs/>
-          <w:iCs/>
-          <w:color w:val="FF0000"/>
-        </w:rPr>
-      </w:pPr>
-      <w:r>
-        <w:rPr>
-          <w:bCs/>
-          <w:iCs/>
-          <w:color w:val="FF0000"/>
-        </w:rPr>
-        <w:t>File word</w:t>
-      </w:r>
-      <w:r>
-        <w:rPr>
-          <w:bCs/>
-          <w:iCs/>
-          <w:color w:val="FF0000"/>
-        </w:rPr>
-        <w:t xml:space="preserve"> </w:t>
-      </w:r>
-      <w:r>
-        <w:rPr>
-          <w:bCs/>
-          <w:iCs/>
-          <w:color w:val="FF0000"/>
-        </w:rPr>
-        <w:t xml:space="preserve">và </w:t>
-      </w:r>
-      <w:r>
-        <w:rPr>
-          <w:bCs/>
-          <w:iCs/>
-          <w:color w:val="FF0000"/>
-        </w:rPr>
-        <w:t>pdf</w:t>
-      </w:r>
-      <w:r>
-        <w:rPr>
-          <w:bCs/>
-          <w:iCs/>
-          <w:color w:val="FF0000"/>
-        </w:rPr>
-        <w:t xml:space="preserve"> báo cáo, </w:t>
-      </w:r>
-      <w:r>
-        <w:rPr>
-          <w:bCs/>
-          <w:iCs/>
-          <w:color w:val="FF0000"/>
-          <w:highlight w:val="yellow"/>
-        </w:rPr>
-        <w:t>ko in ra</w:t>
-      </w:r>
-      <w:r>
-        <w:rPr>
-          <w:bCs/>
-          <w:iCs/>
-          <w:color w:val="FF0000"/>
-        </w:rPr>
-        <w:t>, nộp file mềm.</w:t>
-      </w:r>
-    </w:p>
-    <w:p>
-      <w:pPr>
-        <w:pStyle w:val="ListParagraph"/>
-        <w:numPr>
-          <w:ilvl w:val="0"/>
-          <w:numId w:val="14"/>
-        </w:numPr>
-        <w:rPr>
-          <w:bCs/>
-          <w:iCs/>
-          <w:color w:val="FF0000"/>
-        </w:rPr>
-      </w:pPr>
-      <w:r>
-        <w:rPr>
-          <w:bCs/>
-          <w:iCs/>
-          <w:color w:val="FF0000"/>
-        </w:rPr>
-        <w:t>Slide thuyết trình.</w:t>
-      </w:r>
-    </w:p>
-    <w:p>
-      <w:pPr>
-        <w:pStyle w:val="ListParagraph"/>
-        <w:numPr>
-          <w:ilvl w:val="0"/>
-          <w:numId w:val="14"/>
-        </w:numPr>
-        <w:rPr>
-          <w:bCs/>
-          <w:iCs/>
-          <w:color w:val="FF0000"/>
-        </w:rPr>
-      </w:pPr>
-      <w:r>
-        <w:rPr>
-          <w:bCs/>
-          <w:iCs/>
-          <w:color w:val="FF0000"/>
-        </w:rPr>
-        <w:t>Code</w:t>
-      </w:r>
-      <w:r>
-        <w:rPr>
-          <w:bCs/>
-          <w:iCs/>
-          <w:color w:val="FF0000"/>
-        </w:rPr>
-        <w:t xml:space="preserve"> sản phẩm.</w:t>
-      </w:r>
-      <w:r>
-        <w:rPr>
-          <w:bCs/>
-          <w:iCs/>
-          <w:color w:val="FF0000"/>
-        </w:rPr>
-        <w:t xml:space="preserve"> </w:t>
-      </w:r>
-    </w:p>
-    <w:p>
-      <w:pPr>
-        <w:pStyle w:val="ListParagraph"/>
-        <w:numPr>
-          <w:ilvl w:val="0"/>
-          <w:numId w:val="14"/>
-        </w:numPr>
-        <w:rPr>
-          <w:bCs/>
-          <w:iCs/>
-          <w:color w:val="FF0000"/>
-        </w:rPr>
-      </w:pPr>
-      <w:r>
-        <w:rPr>
-          <w:bCs/>
-          <w:iCs/>
-          <w:color w:val="FF0000"/>
-        </w:rPr>
-        <w:t>Video (</w:t>
-      </w:r>
-      <w:r>
-        <w:rPr>
-          <w:bCs/>
-          <w:iCs/>
-          <w:color w:val="FF0000"/>
-        </w:rPr>
-        <w:t>Hệ tập trung: không bắt buộc. Hệ trực tuyết: Bắt buộc</w:t>
-      </w:r>
-      <w:r>
-        <w:rPr>
-          <w:bCs/>
-          <w:iCs/>
-          <w:color w:val="FF0000"/>
-        </w:rPr>
-        <w:t>)</w:t>
-      </w:r>
-    </w:p>
     <w:p>
       <w:pPr>
         <w:pStyle w:val="BT"/>
@@ -5206,7 +3238,7 @@
                     <pic:cNvPicPr/>
                   </pic:nvPicPr>
                   <pic:blipFill>
-                    <a:blip r:embed="rId47"/>
+                    <a:blip r:embed="rId40"/>
                     <a:stretch>
                       <a:fillRect/>
                     </a:stretch>
@@ -5249,7 +3281,7 @@
       </w:pPr>
     </w:p>
     <w:sectPr>
-      <w:footerReference w:type="default" r:id="rId48"/>
+      <w:footerReference w:type="default" r:id="rId41"/>
       <w:pgSz w:w="11907" w:h="16840" w:code="9"/>
       <w:pgMar w:top="1440" w:right="1134" w:bottom="1440" w:left="1701" w:header="709" w:footer="709" w:gutter="0"/>
       <w:pgNumType w:start="0"/>
@@ -5401,7 +3433,7 @@
             </wp:anchor>
           </w:drawing>
         </mc:Choice>
-        <mc:Fallback xmlns:cx2="http://schemas.microsoft.com/office/drawing/2015/10/21/chartex" xmlns:cx3="http://schemas.microsoft.com/office/drawing/2016/5/9/chartex" xmlns:cx4="http://schemas.microsoft.com/office/drawing/2016/5/10/chartex" xmlns:cx5="http://schemas.microsoft.com/office/drawing/2016/5/11/chartex" xmlns:cx6="http://schemas.microsoft.com/office/drawing/2016/5/12/chartex" xmlns:cx7="http://schemas.microsoft.com/office/drawing/2016/5/13/chartex" xmlns:cx8="http://schemas.microsoft.com/office/drawing/2016/5/14/chartex" xmlns:aink="http://schemas.microsoft.com/office/drawing/2016/ink" xmlns:am3d="http://schemas.microsoft.com/office/drawing/2017/model3d" xmlns:oel="http://schemas.microsoft.com/office/2019/extlst" xmlns:w16cex="http://schemas.microsoft.com/office/word/2018/wordml/cex" xmlns:w16cid="http://schemas.microsoft.com/office/word/2016/wordml/cid" xmlns:w16="http://schemas.microsoft.com/office/word/2018/wordml" xmlns:w16sdtdh="http://schemas.microsoft.com/office/word/2020/wordml/sdtdatahash" xmlns:w16du="http://schemas.microsoft.com/office/word/2023/wordml/word16du">
+        <mc:Fallback xmlns:w16du="http://schemas.microsoft.com/office/word/2023/wordml/word16du" xmlns:w16sdtdh="http://schemas.microsoft.com/office/word/2020/wordml/sdtdatahash" xmlns:w16="http://schemas.microsoft.com/office/word/2018/wordml" xmlns:w16cid="http://schemas.microsoft.com/office/word/2016/wordml/cid" xmlns:w16cex="http://schemas.microsoft.com/office/word/2018/wordml/cex" xmlns:oel="http://schemas.microsoft.com/office/2019/extlst" xmlns:am3d="http://schemas.microsoft.com/office/drawing/2017/model3d" xmlns:aink="http://schemas.microsoft.com/office/drawing/2016/ink" xmlns:cx8="http://schemas.microsoft.com/office/drawing/2016/5/14/chartex" xmlns:cx7="http://schemas.microsoft.com/office/drawing/2016/5/13/chartex" xmlns:cx6="http://schemas.microsoft.com/office/drawing/2016/5/12/chartex" xmlns:cx5="http://schemas.microsoft.com/office/drawing/2016/5/11/chartex" xmlns:cx4="http://schemas.microsoft.com/office/drawing/2016/5/10/chartex" xmlns:cx3="http://schemas.microsoft.com/office/drawing/2016/5/9/chartex" xmlns:cx2="http://schemas.microsoft.com/office/drawing/2015/10/21/chartex">
           <w:pict>
             <v:line w14:anchorId="44D3C256" id="Straight Connector 1" o:spid="_x0000_s1026" style="position:absolute;z-index:251659264;visibility:visible;mso-wrap-style:square;mso-width-percent:0;mso-wrap-distance-left:9pt;mso-wrap-distance-top:0;mso-wrap-distance-right:9pt;mso-wrap-distance-bottom:0;mso-position-horizontal:absolute;mso-position-horizontal-relative:text;mso-position-vertical:absolute;mso-position-vertical-relative:text;mso-width-percent:0;mso-width-relative:margin" from="-1.05pt,-4.85pt" to="452.5pt,-4.85pt" o:gfxdata="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" strokecolor="black [3213]" strokeweight=".5pt">
               <v:stroke joinstyle="miter"/>
@@ -5426,7 +3458,7 @@
       <w:rPr>
         <w:noProof/>
       </w:rPr>
-      <w:t>13</w:t>
+      <w:t>1</w:t>
     </w:r>
     <w:r>
       <w:rPr>
@@ -5524,7 +3556,7 @@
             </wp:anchor>
           </w:drawing>
         </mc:Choice>
-        <mc:Fallback xmlns:cx2="http://schemas.microsoft.com/office/drawing/2015/10/21/chartex" xmlns:cx3="http://schemas.microsoft.com/office/drawing/2016/5/9/chartex" xmlns:cx4="http://schemas.microsoft.com/office/drawing/2016/5/10/chartex" xmlns:cx5="http://schemas.microsoft.com/office/drawing/2016/5/11/chartex" xmlns:cx6="http://schemas.microsoft.com/office/drawing/2016/5/12/chartex" xmlns:cx7="http://schemas.microsoft.com/office/drawing/2016/5/13/chartex" xmlns:cx8="http://schemas.microsoft.com/office/drawing/2016/5/14/chartex" xmlns:aink="http://schemas.microsoft.com/office/drawing/2016/ink" xmlns:am3d="http://schemas.microsoft.com/office/drawing/2017/model3d" xmlns:oel="http://schemas.microsoft.com/office/2019/extlst" xmlns:w16cex="http://schemas.microsoft.com/office/word/2018/wordml/cex" xmlns:w16cid="http://schemas.microsoft.com/office/word/2016/wordml/cid" xmlns:w16="http://schemas.microsoft.com/office/word/2018/wordml" xmlns:w16sdtdh="http://schemas.microsoft.com/office/word/2020/wordml/sdtdatahash" xmlns:w16du="http://schemas.microsoft.com/office/word/2023/wordml/word16du">
+        <mc:Fallback xmlns:w16du="http://schemas.microsoft.com/office/word/2023/wordml/word16du" xmlns:w16sdtdh="http://schemas.microsoft.com/office/word/2020/wordml/sdtdatahash" xmlns:w16="http://schemas.microsoft.com/office/word/2018/wordml" xmlns:w16cid="http://schemas.microsoft.com/office/word/2016/wordml/cid" xmlns:w16cex="http://schemas.microsoft.com/office/word/2018/wordml/cex" xmlns:oel="http://schemas.microsoft.com/office/2019/extlst" xmlns:am3d="http://schemas.microsoft.com/office/drawing/2017/model3d" xmlns:aink="http://schemas.microsoft.com/office/drawing/2016/ink" xmlns:cx8="http://schemas.microsoft.com/office/drawing/2016/5/14/chartex" xmlns:cx7="http://schemas.microsoft.com/office/drawing/2016/5/13/chartex" xmlns:cx6="http://schemas.microsoft.com/office/drawing/2016/5/12/chartex" xmlns:cx5="http://schemas.microsoft.com/office/drawing/2016/5/11/chartex" xmlns:cx4="http://schemas.microsoft.com/office/drawing/2016/5/10/chartex" xmlns:cx3="http://schemas.microsoft.com/office/drawing/2016/5/9/chartex" xmlns:cx2="http://schemas.microsoft.com/office/drawing/2015/10/21/chartex">
           <w:pict>
             <v:line w14:anchorId="4DF80C25" id="Straight Connector 2" o:spid="_x0000_s1026" style="position:absolute;z-index:251665408;visibility:visible;mso-wrap-style:square;mso-width-percent:0;mso-wrap-distance-left:9pt;mso-wrap-distance-top:0;mso-wrap-distance-right:9pt;mso-wrap-distance-bottom:0;mso-position-horizontal:absolute;mso-position-horizontal-relative:text;mso-position-vertical:absolute;mso-position-vertical-relative:text;mso-width-percent:0;mso-width-relative:margin" from="-1.05pt,-4.85pt" to="452.5pt,-4.85pt" o:gfxdata="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" strokecolor="black [3213]" strokeweight=".5pt">
               <v:stroke joinstyle="miter"/>
@@ -5664,7 +3696,7 @@
             </wp:anchor>
           </w:drawing>
         </mc:Choice>
-        <mc:Fallback xmlns:cx2="http://schemas.microsoft.com/office/drawing/2015/10/21/chartex" xmlns:cx3="http://schemas.microsoft.com/office/drawing/2016/5/9/chartex" xmlns:cx4="http://schemas.microsoft.com/office/drawing/2016/5/10/chartex" xmlns:cx5="http://schemas.microsoft.com/office/drawing/2016/5/11/chartex" xmlns:cx6="http://schemas.microsoft.com/office/drawing/2016/5/12/chartex" xmlns:cx7="http://schemas.microsoft.com/office/drawing/2016/5/13/chartex" xmlns:cx8="http://schemas.microsoft.com/office/drawing/2016/5/14/chartex" xmlns:aink="http://schemas.microsoft.com/office/drawing/2016/ink" xmlns:am3d="http://schemas.microsoft.com/office/drawing/2017/model3d" xmlns:oel="http://schemas.microsoft.com/office/2019/extlst" xmlns:w16cex="http://schemas.microsoft.com/office/word/2018/wordml/cex" xmlns:w16cid="http://schemas.microsoft.com/office/word/2016/wordml/cid" xmlns:w16="http://schemas.microsoft.com/office/word/2018/wordml" xmlns:w16sdtdh="http://schemas.microsoft.com/office/word/2020/wordml/sdtdatahash" xmlns:w16du="http://schemas.microsoft.com/office/word/2023/wordml/word16du">
+        <mc:Fallback xmlns:w16du="http://schemas.microsoft.com/office/word/2023/wordml/word16du" xmlns:w16sdtdh="http://schemas.microsoft.com/office/word/2020/wordml/sdtdatahash" xmlns:w16="http://schemas.microsoft.com/office/word/2018/wordml" xmlns:w16cid="http://schemas.microsoft.com/office/word/2016/wordml/cid" xmlns:w16cex="http://schemas.microsoft.com/office/word/2018/wordml/cex" xmlns:oel="http://schemas.microsoft.com/office/2019/extlst" xmlns:am3d="http://schemas.microsoft.com/office/drawing/2017/model3d" xmlns:aink="http://schemas.microsoft.com/office/drawing/2016/ink" xmlns:cx8="http://schemas.microsoft.com/office/drawing/2016/5/14/chartex" xmlns:cx7="http://schemas.microsoft.com/office/drawing/2016/5/13/chartex" xmlns:cx6="http://schemas.microsoft.com/office/drawing/2016/5/12/chartex" xmlns:cx5="http://schemas.microsoft.com/office/drawing/2016/5/11/chartex" xmlns:cx4="http://schemas.microsoft.com/office/drawing/2016/5/10/chartex" xmlns:cx3="http://schemas.microsoft.com/office/drawing/2016/5/9/chartex" xmlns:cx2="http://schemas.microsoft.com/office/drawing/2015/10/21/chartex">
           <w:pict>
             <v:line w14:anchorId="1D42B8E5" id="Straight Connector 3" o:spid="_x0000_s1026" style="position:absolute;z-index:251663360;visibility:visible;mso-wrap-style:square;mso-width-percent:0;mso-wrap-distance-left:9pt;mso-wrap-distance-top:0;mso-wrap-distance-right:9pt;mso-wrap-distance-bottom:0;mso-position-horizontal:absolute;mso-position-horizontal-relative:text;mso-position-vertical:absolute;mso-position-vertical-relative:text;mso-width-percent:0;mso-width-relative:margin" from="0,16.45pt" to="453.55pt,16.45pt" o:gfxdata="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" strokecolor="black [3213]" strokeweight=".5pt">
               <v:stroke joinstyle="miter"/>
@@ -9579,7 +7611,7 @@
 </file>
 
 <file path=customXml/itemProps1.xml><?xml version="1.0" encoding="utf-8"?>
-<ds:datastoreItem xmlns:ds="http://schemas.openxmlformats.org/officeDocument/2006/customXml" ds:itemID="{09DAD80D-0E0F-489E-AE31-FDE1EF2AEAF5}">
+<ds:datastoreItem xmlns:ds="http://schemas.openxmlformats.org/officeDocument/2006/customXml" ds:itemID="{73B24910-4816-4477-829B-71B203F5E4BC}">
   <ds:schemaRefs>
     <ds:schemaRef ds:uri="http://schemas.openxmlformats.org/officeDocument/2006/bibliography"/>
   </ds:schemaRefs>

</xml_diff>